<commit_message>
Worked on release of ModelMuse version 5.4. Updated test results.
</commit_message>
<xml_diff>
--- a/ModelMuse/Documentation5/MODFLOW 6 Supported Features.docx
+++ b/ModelMuse/Documentation5/MODFLOW 6 Supported Features.docx
@@ -1352,7 +1352,7 @@
               <w:pStyle w:val="TableCellBody"/>
             </w:pPr>
             <w:r>
-              <w:t>Iterative Model Solution</w:t>
+              <w:t>Groundwater Energy Transport (GWE) Exchange</w:t>
             </w:r>
           </w:p>
         </w:tc>
@@ -1364,6 +1364,9 @@
             <w:pPr>
               <w:pStyle w:val="TableCellBody"/>
             </w:pPr>
+            <w:r>
+              <w:t xml:space="preserve">not </w:t>
+            </w:r>
             <w:r>
               <w:t>supported</w:t>
             </w:r>
@@ -1394,7 +1397,7 @@
               <w:pStyle w:val="TableCellBody"/>
             </w:pPr>
             <w:r>
-              <w:t>Observation (OBS) Utility</w:t>
+              <w:t>Iterative Model Solution</w:t>
             </w:r>
           </w:p>
         </w:tc>
@@ -1436,7 +1439,7 @@
               <w:pStyle w:val="TableCellBody"/>
             </w:pPr>
             <w:r>
-              <w:t>Time-Variable Input</w:t>
+              <w:t>Observation (OBS) Utility</w:t>
             </w:r>
           </w:p>
         </w:tc>
@@ -1478,7 +1481,7 @@
               <w:pStyle w:val="TableCellBody"/>
             </w:pPr>
             <w:r>
-              <w:t>Multiple Flow Models in One Simulation</w:t>
+              <w:t>Time-Variable Input</w:t>
             </w:r>
           </w:p>
         </w:tc>
@@ -1490,9 +1493,6 @@
             <w:pPr>
               <w:pStyle w:val="TableCellBody"/>
             </w:pPr>
-            <w:r>
-              <w:t xml:space="preserve">not </w:t>
-            </w:r>
             <w:r>
               <w:t>supported</w:t>
             </w:r>
@@ -1523,7 +1523,7 @@
               <w:pStyle w:val="TableCellBody"/>
             </w:pPr>
             <w:r>
-              <w:t>Multiple Stress Packages of the Same Type</w:t>
+              <w:t>Multiple Flow Models in One Simulation</w:t>
             </w:r>
           </w:p>
         </w:tc>
@@ -1568,7 +1568,7 @@
               <w:pStyle w:val="TableCellBody"/>
             </w:pPr>
             <w:r>
-              <w:t>Groundwater Transport</w:t>
+              <w:t>Multiple Stress Packages of the Same Type</w:t>
             </w:r>
           </w:p>
         </w:tc>
@@ -1580,6 +1580,9 @@
             <w:pPr>
               <w:pStyle w:val="TableCellBody"/>
             </w:pPr>
+            <w:r>
+              <w:t xml:space="preserve">not </w:t>
+            </w:r>
             <w:r>
               <w:t>supported</w:t>
             </w:r>
@@ -1610,7 +1613,7 @@
               <w:pStyle w:val="TableCellBody"/>
             </w:pPr>
             <w:r>
-              <w:t>Time-varying Hydraulic Conductivity Package</w:t>
+              <w:t>Groundwater Transport</w:t>
             </w:r>
           </w:p>
         </w:tc>
@@ -1652,7 +1655,7 @@
               <w:pStyle w:val="TableCellBody"/>
             </w:pPr>
             <w:r>
-              <w:t>Time-Varying Storage Package</w:t>
+              <w:t>Time-varying Hydraulic Conductivity Package</w:t>
             </w:r>
           </w:p>
         </w:tc>
@@ -1694,7 +1697,7 @@
               <w:pStyle w:val="TableCellBody"/>
             </w:pPr>
             <w:r>
-              <w:t>Buoyancy Package</w:t>
+              <w:t>Time-Varying Storage Package</w:t>
             </w:r>
           </w:p>
         </w:tc>
@@ -1736,7 +1739,7 @@
               <w:pStyle w:val="TableCellBody"/>
             </w:pPr>
             <w:r>
-              <w:t>Viscosity Package</w:t>
+              <w:t>Buoyancy Package</w:t>
             </w:r>
           </w:p>
         </w:tc>
@@ -1778,6 +1781,48 @@
               <w:pStyle w:val="TableCellBody"/>
             </w:pPr>
             <w:r>
+              <w:t>Viscosity Package</w:t>
+            </w:r>
+          </w:p>
+        </w:tc>
+        <w:tc>
+          <w:tcPr>
+            <w:tcW w:w="1440" w:type="dxa"/>
+          </w:tcPr>
+          <w:p>
+            <w:pPr>
+              <w:pStyle w:val="TableCellBody"/>
+            </w:pPr>
+            <w:r>
+              <w:t>supported</w:t>
+            </w:r>
+          </w:p>
+        </w:tc>
+        <w:tc>
+          <w:tcPr>
+            <w:tcW w:w="3870" w:type="dxa"/>
+            <w:vAlign w:val="center"/>
+          </w:tcPr>
+          <w:p>
+            <w:pPr>
+              <w:pStyle w:val="TableCellBody"/>
+            </w:pPr>
+          </w:p>
+        </w:tc>
+      </w:tr>
+      <w:tr>
+        <w:trPr>
+          <w:trHeight w:val="20"/>
+        </w:trPr>
+        <w:tc>
+          <w:tcPr>
+            <w:tcW w:w="4050" w:type="dxa"/>
+          </w:tcPr>
+          <w:p>
+            <w:pPr>
+              <w:pStyle w:val="TableCellBody"/>
+            </w:pPr>
+            <w:r>
               <w:t>Groundwater Energy Transport (GWE)</w:t>
             </w:r>
           </w:p>
@@ -1790,9 +1835,6 @@
             <w:pPr>
               <w:pStyle w:val="TableCellBody"/>
             </w:pPr>
-            <w:r>
-              <w:t xml:space="preserve">not </w:t>
-            </w:r>
             <w:r>
               <w:t>supported</w:t>
             </w:r>

</xml_diff>

<commit_message>
Updated to respond to colleague review.
</commit_message>
<xml_diff>
--- a/ModelMuse/Documentation5/MODFLOW 6 Supported Features.docx
+++ b/ModelMuse/Documentation5/MODFLOW 6 Supported Features.docx
@@ -7,8 +7,13 @@
         <w:pStyle w:val="TableTitle"/>
       </w:pPr>
       <w:r>
-        <w:t>Status of MODFLOW 6 Packages and Features in ModelMuse</w:t>
+        <w:t xml:space="preserve">Status of MODFLOW 6 Packages and Features in </w:t>
       </w:r>
+      <w:proofErr w:type="spellStart"/>
+      <w:r>
+        <w:t>ModelMuse</w:t>
+      </w:r>
+      <w:proofErr w:type="spellEnd"/>
     </w:p>
     <w:tbl>
       <w:tblPr>
@@ -1108,8 +1113,13 @@
             <w:pPr>
               <w:pStyle w:val="TableCellBody"/>
             </w:pPr>
+            <w:proofErr w:type="spellStart"/>
             <w:r>
-              <w:t>Rhk (</w:t>
+              <w:t>Rhk</w:t>
+            </w:r>
+            <w:proofErr w:type="spellEnd"/>
+            <w:r>
+              <w:t xml:space="preserve"> (</w:t>
             </w:r>
             <w:r>
               <w:t xml:space="preserve">time-varying </w:t>
@@ -1342,6 +1352,7 @@
       <w:tr>
         <w:trPr>
           <w:trHeight w:val="20"/>
+          <w:del w:id="0" w:author="Winston, Richard B" w:date="2025-06-01T10:07:00Z"/>
         </w:trPr>
         <w:tc>
           <w:tcPr>
@@ -1350,9 +1361,193 @@
           <w:p>
             <w:pPr>
               <w:pStyle w:val="TableCellBody"/>
+              <w:rPr>
+                <w:del w:id="1" w:author="Winston, Richard B" w:date="2025-06-01T10:07:00Z"/>
+              </w:rPr>
+            </w:pPr>
+            <w:del w:id="2" w:author="Winston, Richard B" w:date="2025-06-01T10:06:00Z">
+              <w:r>
+                <w:delText>Groundwater Energy Transport (GWE) Exchange</w:delText>
+              </w:r>
+            </w:del>
+          </w:p>
+        </w:tc>
+        <w:tc>
+          <w:tcPr>
+            <w:tcW w:w="1440" w:type="dxa"/>
+          </w:tcPr>
+          <w:p>
+            <w:pPr>
+              <w:pStyle w:val="TableCellBody"/>
+              <w:rPr>
+                <w:del w:id="3" w:author="Winston, Richard B" w:date="2025-06-01T10:07:00Z"/>
+              </w:rPr>
+            </w:pPr>
+            <w:del w:id="4" w:author="Winston, Richard B" w:date="2025-06-01T10:06:00Z">
+              <w:r>
+                <w:delText xml:space="preserve">not </w:delText>
+              </w:r>
+              <w:r>
+                <w:delText>supported</w:delText>
+              </w:r>
+            </w:del>
+          </w:p>
+        </w:tc>
+        <w:tc>
+          <w:tcPr>
+            <w:tcW w:w="3870" w:type="dxa"/>
+            <w:vAlign w:val="center"/>
+          </w:tcPr>
+          <w:p>
+            <w:pPr>
+              <w:pStyle w:val="TableCellBody"/>
+              <w:rPr>
+                <w:del w:id="5" w:author="Winston, Richard B" w:date="2025-06-01T10:07:00Z"/>
+              </w:rPr>
+            </w:pPr>
+          </w:p>
+        </w:tc>
+      </w:tr>
+      <w:tr>
+        <w:trPr>
+          <w:trHeight w:val="20"/>
+        </w:trPr>
+        <w:tc>
+          <w:tcPr>
+            <w:tcW w:w="4050" w:type="dxa"/>
+          </w:tcPr>
+          <w:p>
+            <w:pPr>
+              <w:pStyle w:val="TableCellBody"/>
             </w:pPr>
             <w:r>
-              <w:t>Groundwater Energy Transport (GWE) Exchange</w:t>
+              <w:t>Iterative Model Solution</w:t>
+            </w:r>
+          </w:p>
+        </w:tc>
+        <w:tc>
+          <w:tcPr>
+            <w:tcW w:w="1440" w:type="dxa"/>
+          </w:tcPr>
+          <w:p>
+            <w:pPr>
+              <w:pStyle w:val="TableCellBody"/>
+            </w:pPr>
+            <w:r>
+              <w:t>supported</w:t>
+            </w:r>
+          </w:p>
+        </w:tc>
+        <w:tc>
+          <w:tcPr>
+            <w:tcW w:w="3870" w:type="dxa"/>
+            <w:vAlign w:val="center"/>
+          </w:tcPr>
+          <w:p>
+            <w:pPr>
+              <w:pStyle w:val="TableCellBody"/>
+            </w:pPr>
+          </w:p>
+        </w:tc>
+      </w:tr>
+      <w:tr>
+        <w:trPr>
+          <w:trHeight w:val="20"/>
+        </w:trPr>
+        <w:tc>
+          <w:tcPr>
+            <w:tcW w:w="4050" w:type="dxa"/>
+          </w:tcPr>
+          <w:p>
+            <w:pPr>
+              <w:pStyle w:val="TableCellBody"/>
+            </w:pPr>
+            <w:r>
+              <w:t>Observation (OBS) Utility</w:t>
+            </w:r>
+          </w:p>
+        </w:tc>
+        <w:tc>
+          <w:tcPr>
+            <w:tcW w:w="1440" w:type="dxa"/>
+          </w:tcPr>
+          <w:p>
+            <w:pPr>
+              <w:pStyle w:val="TableCellBody"/>
+            </w:pPr>
+            <w:r>
+              <w:t>supported</w:t>
+            </w:r>
+          </w:p>
+        </w:tc>
+        <w:tc>
+          <w:tcPr>
+            <w:tcW w:w="3870" w:type="dxa"/>
+            <w:vAlign w:val="center"/>
+          </w:tcPr>
+          <w:p>
+            <w:pPr>
+              <w:pStyle w:val="TableCellBody"/>
+            </w:pPr>
+          </w:p>
+        </w:tc>
+      </w:tr>
+      <w:tr>
+        <w:trPr>
+          <w:trHeight w:val="20"/>
+        </w:trPr>
+        <w:tc>
+          <w:tcPr>
+            <w:tcW w:w="4050" w:type="dxa"/>
+          </w:tcPr>
+          <w:p>
+            <w:pPr>
+              <w:pStyle w:val="TableCellBody"/>
+            </w:pPr>
+            <w:r>
+              <w:t>Time-Variable Input</w:t>
+            </w:r>
+          </w:p>
+        </w:tc>
+        <w:tc>
+          <w:tcPr>
+            <w:tcW w:w="1440" w:type="dxa"/>
+          </w:tcPr>
+          <w:p>
+            <w:pPr>
+              <w:pStyle w:val="TableCellBody"/>
+            </w:pPr>
+            <w:r>
+              <w:t>supported</w:t>
+            </w:r>
+          </w:p>
+        </w:tc>
+        <w:tc>
+          <w:tcPr>
+            <w:tcW w:w="3870" w:type="dxa"/>
+            <w:vAlign w:val="center"/>
+          </w:tcPr>
+          <w:p>
+            <w:pPr>
+              <w:pStyle w:val="TableCellBody"/>
+            </w:pPr>
+          </w:p>
+        </w:tc>
+      </w:tr>
+      <w:tr>
+        <w:trPr>
+          <w:trHeight w:val="20"/>
+        </w:trPr>
+        <w:tc>
+          <w:tcPr>
+            <w:tcW w:w="4050" w:type="dxa"/>
+          </w:tcPr>
+          <w:p>
+            <w:pPr>
+              <w:pStyle w:val="TableCellBody"/>
+            </w:pPr>
+            <w:r>
+              <w:t>Multiple Flow Models in One Simulation</w:t>
             </w:r>
           </w:p>
         </w:tc>
@@ -1397,133 +1592,7 @@
               <w:pStyle w:val="TableCellBody"/>
             </w:pPr>
             <w:r>
-              <w:t>Iterative Model Solution</w:t>
-            </w:r>
-          </w:p>
-        </w:tc>
-        <w:tc>
-          <w:tcPr>
-            <w:tcW w:w="1440" w:type="dxa"/>
-          </w:tcPr>
-          <w:p>
-            <w:pPr>
-              <w:pStyle w:val="TableCellBody"/>
-            </w:pPr>
-            <w:r>
-              <w:t>supported</w:t>
-            </w:r>
-          </w:p>
-        </w:tc>
-        <w:tc>
-          <w:tcPr>
-            <w:tcW w:w="3870" w:type="dxa"/>
-            <w:vAlign w:val="center"/>
-          </w:tcPr>
-          <w:p>
-            <w:pPr>
-              <w:pStyle w:val="TableCellBody"/>
-            </w:pPr>
-          </w:p>
-        </w:tc>
-      </w:tr>
-      <w:tr>
-        <w:trPr>
-          <w:trHeight w:val="20"/>
-        </w:trPr>
-        <w:tc>
-          <w:tcPr>
-            <w:tcW w:w="4050" w:type="dxa"/>
-          </w:tcPr>
-          <w:p>
-            <w:pPr>
-              <w:pStyle w:val="TableCellBody"/>
-            </w:pPr>
-            <w:r>
-              <w:t>Observation (OBS) Utility</w:t>
-            </w:r>
-          </w:p>
-        </w:tc>
-        <w:tc>
-          <w:tcPr>
-            <w:tcW w:w="1440" w:type="dxa"/>
-          </w:tcPr>
-          <w:p>
-            <w:pPr>
-              <w:pStyle w:val="TableCellBody"/>
-            </w:pPr>
-            <w:r>
-              <w:t>supported</w:t>
-            </w:r>
-          </w:p>
-        </w:tc>
-        <w:tc>
-          <w:tcPr>
-            <w:tcW w:w="3870" w:type="dxa"/>
-            <w:vAlign w:val="center"/>
-          </w:tcPr>
-          <w:p>
-            <w:pPr>
-              <w:pStyle w:val="TableCellBody"/>
-            </w:pPr>
-          </w:p>
-        </w:tc>
-      </w:tr>
-      <w:tr>
-        <w:trPr>
-          <w:trHeight w:val="20"/>
-        </w:trPr>
-        <w:tc>
-          <w:tcPr>
-            <w:tcW w:w="4050" w:type="dxa"/>
-          </w:tcPr>
-          <w:p>
-            <w:pPr>
-              <w:pStyle w:val="TableCellBody"/>
-            </w:pPr>
-            <w:r>
-              <w:t>Time-Variable Input</w:t>
-            </w:r>
-          </w:p>
-        </w:tc>
-        <w:tc>
-          <w:tcPr>
-            <w:tcW w:w="1440" w:type="dxa"/>
-          </w:tcPr>
-          <w:p>
-            <w:pPr>
-              <w:pStyle w:val="TableCellBody"/>
-            </w:pPr>
-            <w:r>
-              <w:t>supported</w:t>
-            </w:r>
-          </w:p>
-        </w:tc>
-        <w:tc>
-          <w:tcPr>
-            <w:tcW w:w="3870" w:type="dxa"/>
-            <w:vAlign w:val="center"/>
-          </w:tcPr>
-          <w:p>
-            <w:pPr>
-              <w:pStyle w:val="TableCellBody"/>
-            </w:pPr>
-          </w:p>
-        </w:tc>
-      </w:tr>
-      <w:tr>
-        <w:trPr>
-          <w:trHeight w:val="20"/>
-        </w:trPr>
-        <w:tc>
-          <w:tcPr>
-            <w:tcW w:w="4050" w:type="dxa"/>
-          </w:tcPr>
-          <w:p>
-            <w:pPr>
-              <w:pStyle w:val="TableCellBody"/>
-            </w:pPr>
-            <w:r>
-              <w:t>Multiple Flow Models in One Simulation</w:t>
+              <w:t>Multiple Stress Packages of the Same Type</w:t>
             </w:r>
           </w:p>
         </w:tc>
@@ -1568,7 +1637,267 @@
               <w:pStyle w:val="TableCellBody"/>
             </w:pPr>
             <w:r>
-              <w:t>Multiple Stress Packages of the Same Type</w:t>
+              <w:t xml:space="preserve">Groundwater </w:t>
+            </w:r>
+            <w:ins w:id="6" w:author="Winston, Richard B" w:date="2025-06-01T10:02:00Z">
+              <w:r>
+                <w:t xml:space="preserve">(Solute) </w:t>
+              </w:r>
+            </w:ins>
+            <w:r>
+              <w:t>Transport</w:t>
+            </w:r>
+          </w:p>
+        </w:tc>
+        <w:tc>
+          <w:tcPr>
+            <w:tcW w:w="1440" w:type="dxa"/>
+          </w:tcPr>
+          <w:p>
+            <w:pPr>
+              <w:pStyle w:val="TableCellBody"/>
+            </w:pPr>
+            <w:r>
+              <w:t>supported</w:t>
+            </w:r>
+          </w:p>
+        </w:tc>
+        <w:tc>
+          <w:tcPr>
+            <w:tcW w:w="3870" w:type="dxa"/>
+            <w:vAlign w:val="center"/>
+          </w:tcPr>
+          <w:p>
+            <w:pPr>
+              <w:pStyle w:val="TableCellBody"/>
+            </w:pPr>
+          </w:p>
+        </w:tc>
+      </w:tr>
+      <w:tr>
+        <w:trPr>
+          <w:trHeight w:val="20"/>
+        </w:trPr>
+        <w:tc>
+          <w:tcPr>
+            <w:tcW w:w="4050" w:type="dxa"/>
+          </w:tcPr>
+          <w:p>
+            <w:pPr>
+              <w:pStyle w:val="TableCellBody"/>
+            </w:pPr>
+            <w:r>
+              <w:t>Time-varying Hydraulic Conductivity Package</w:t>
+            </w:r>
+          </w:p>
+        </w:tc>
+        <w:tc>
+          <w:tcPr>
+            <w:tcW w:w="1440" w:type="dxa"/>
+          </w:tcPr>
+          <w:p>
+            <w:pPr>
+              <w:pStyle w:val="TableCellBody"/>
+            </w:pPr>
+            <w:r>
+              <w:t>supported</w:t>
+            </w:r>
+          </w:p>
+        </w:tc>
+        <w:tc>
+          <w:tcPr>
+            <w:tcW w:w="3870" w:type="dxa"/>
+            <w:vAlign w:val="center"/>
+          </w:tcPr>
+          <w:p>
+            <w:pPr>
+              <w:pStyle w:val="TableCellBody"/>
+            </w:pPr>
+          </w:p>
+        </w:tc>
+      </w:tr>
+      <w:tr>
+        <w:trPr>
+          <w:trHeight w:val="20"/>
+        </w:trPr>
+        <w:tc>
+          <w:tcPr>
+            <w:tcW w:w="4050" w:type="dxa"/>
+          </w:tcPr>
+          <w:p>
+            <w:pPr>
+              <w:pStyle w:val="TableCellBody"/>
+            </w:pPr>
+            <w:r>
+              <w:t>Time-Varying Storage Package</w:t>
+            </w:r>
+          </w:p>
+        </w:tc>
+        <w:tc>
+          <w:tcPr>
+            <w:tcW w:w="1440" w:type="dxa"/>
+          </w:tcPr>
+          <w:p>
+            <w:pPr>
+              <w:pStyle w:val="TableCellBody"/>
+            </w:pPr>
+            <w:r>
+              <w:t>supported</w:t>
+            </w:r>
+          </w:p>
+        </w:tc>
+        <w:tc>
+          <w:tcPr>
+            <w:tcW w:w="3870" w:type="dxa"/>
+            <w:vAlign w:val="center"/>
+          </w:tcPr>
+          <w:p>
+            <w:pPr>
+              <w:pStyle w:val="TableCellBody"/>
+            </w:pPr>
+          </w:p>
+        </w:tc>
+      </w:tr>
+      <w:tr>
+        <w:trPr>
+          <w:trHeight w:val="20"/>
+        </w:trPr>
+        <w:tc>
+          <w:tcPr>
+            <w:tcW w:w="4050" w:type="dxa"/>
+          </w:tcPr>
+          <w:p>
+            <w:pPr>
+              <w:pStyle w:val="TableCellBody"/>
+            </w:pPr>
+            <w:r>
+              <w:t>Buoyancy Package</w:t>
+            </w:r>
+          </w:p>
+        </w:tc>
+        <w:tc>
+          <w:tcPr>
+            <w:tcW w:w="1440" w:type="dxa"/>
+          </w:tcPr>
+          <w:p>
+            <w:pPr>
+              <w:pStyle w:val="TableCellBody"/>
+            </w:pPr>
+            <w:r>
+              <w:t>supported</w:t>
+            </w:r>
+          </w:p>
+        </w:tc>
+        <w:tc>
+          <w:tcPr>
+            <w:tcW w:w="3870" w:type="dxa"/>
+            <w:vAlign w:val="center"/>
+          </w:tcPr>
+          <w:p>
+            <w:pPr>
+              <w:pStyle w:val="TableCellBody"/>
+            </w:pPr>
+          </w:p>
+        </w:tc>
+      </w:tr>
+      <w:tr>
+        <w:trPr>
+          <w:trHeight w:val="20"/>
+        </w:trPr>
+        <w:tc>
+          <w:tcPr>
+            <w:tcW w:w="4050" w:type="dxa"/>
+          </w:tcPr>
+          <w:p>
+            <w:pPr>
+              <w:pStyle w:val="TableCellBody"/>
+            </w:pPr>
+            <w:r>
+              <w:t>Viscosity Package</w:t>
+            </w:r>
+          </w:p>
+        </w:tc>
+        <w:tc>
+          <w:tcPr>
+            <w:tcW w:w="1440" w:type="dxa"/>
+          </w:tcPr>
+          <w:p>
+            <w:pPr>
+              <w:pStyle w:val="TableCellBody"/>
+            </w:pPr>
+            <w:r>
+              <w:t>supported</w:t>
+            </w:r>
+          </w:p>
+        </w:tc>
+        <w:tc>
+          <w:tcPr>
+            <w:tcW w:w="3870" w:type="dxa"/>
+            <w:vAlign w:val="center"/>
+          </w:tcPr>
+          <w:p>
+            <w:pPr>
+              <w:pStyle w:val="TableCellBody"/>
+            </w:pPr>
+          </w:p>
+        </w:tc>
+      </w:tr>
+      <w:tr>
+        <w:trPr>
+          <w:trHeight w:val="20"/>
+        </w:trPr>
+        <w:tc>
+          <w:tcPr>
+            <w:tcW w:w="4050" w:type="dxa"/>
+          </w:tcPr>
+          <w:p>
+            <w:pPr>
+              <w:pStyle w:val="TableCellBody"/>
+            </w:pPr>
+            <w:r>
+              <w:t>Groundwater Energy Transport (GWE)</w:t>
+            </w:r>
+          </w:p>
+        </w:tc>
+        <w:tc>
+          <w:tcPr>
+            <w:tcW w:w="1440" w:type="dxa"/>
+          </w:tcPr>
+          <w:p>
+            <w:pPr>
+              <w:pStyle w:val="TableCellBody"/>
+            </w:pPr>
+            <w:r>
+              <w:t>supported</w:t>
+            </w:r>
+          </w:p>
+        </w:tc>
+        <w:tc>
+          <w:tcPr>
+            <w:tcW w:w="3870" w:type="dxa"/>
+            <w:vAlign w:val="center"/>
+          </w:tcPr>
+          <w:p>
+            <w:pPr>
+              <w:pStyle w:val="TableCellBody"/>
+            </w:pPr>
+          </w:p>
+        </w:tc>
+      </w:tr>
+      <w:tr>
+        <w:trPr>
+          <w:trHeight w:val="20"/>
+        </w:trPr>
+        <w:tc>
+          <w:tcPr>
+            <w:tcW w:w="4050" w:type="dxa"/>
+          </w:tcPr>
+          <w:p>
+            <w:pPr>
+              <w:pStyle w:val="TableCellBody"/>
+            </w:pPr>
+            <w:r>
+              <w:t>Particle Tracking (PRT)</w:t>
             </w:r>
           </w:p>
         </w:tc>
@@ -1613,7 +1942,7 @@
               <w:pStyle w:val="TableCellBody"/>
             </w:pPr>
             <w:r>
-              <w:t>Groundwater Transport</w:t>
+              <w:t>AUXMULTNAME</w:t>
             </w:r>
           </w:p>
         </w:tc>
@@ -1645,6 +1974,7 @@
       <w:tr>
         <w:trPr>
           <w:trHeight w:val="20"/>
+          <w:ins w:id="7" w:author="Winston, Richard B" w:date="2025-06-01T10:08:00Z"/>
         </w:trPr>
         <w:tc>
           <w:tcPr>
@@ -1653,10 +1983,25 @@
           <w:p>
             <w:pPr>
               <w:pStyle w:val="TableCellBody"/>
-            </w:pPr>
-            <w:r>
-              <w:t>Time-varying Hydraulic Conductivity Package</w:t>
-            </w:r>
+              <w:rPr>
+                <w:ins w:id="8" w:author="Winston, Richard B" w:date="2025-06-01T10:08:00Z"/>
+              </w:rPr>
+            </w:pPr>
+            <w:ins w:id="9" w:author="Winston, Richard B" w:date="2025-06-01T10:08:00Z">
+              <w:r>
+                <w:t xml:space="preserve">Initial Conditions (IC) for </w:t>
+              </w:r>
+            </w:ins>
+            <w:ins w:id="10" w:author="Winston, Richard B" w:date="2025-06-01T10:09:00Z">
+              <w:r>
+                <w:t xml:space="preserve">Groundwater (Solute) Transport </w:t>
+              </w:r>
+            </w:ins>
+            <w:ins w:id="11" w:author="Winston, Richard B" w:date="2025-06-01T10:08:00Z">
+              <w:r>
+                <w:t>GWT</w:t>
+              </w:r>
+            </w:ins>
           </w:p>
         </w:tc>
         <w:tc>
@@ -1666,10 +2011,15 @@
           <w:p>
             <w:pPr>
               <w:pStyle w:val="TableCellBody"/>
-            </w:pPr>
-            <w:r>
-              <w:t>supported</w:t>
-            </w:r>
+              <w:rPr>
+                <w:ins w:id="12" w:author="Winston, Richard B" w:date="2025-06-01T10:08:00Z"/>
+              </w:rPr>
+            </w:pPr>
+            <w:ins w:id="13" w:author="Winston, Richard B" w:date="2025-06-01T10:18:00Z">
+              <w:r>
+                <w:t>supported</w:t>
+              </w:r>
+            </w:ins>
           </w:p>
         </w:tc>
         <w:tc>
@@ -1680,6 +2030,9 @@
           <w:p>
             <w:pPr>
               <w:pStyle w:val="TableCellBody"/>
+              <w:rPr>
+                <w:ins w:id="14" w:author="Winston, Richard B" w:date="2025-06-01T10:08:00Z"/>
+              </w:rPr>
             </w:pPr>
           </w:p>
         </w:tc>
@@ -1687,6 +2040,7 @@
       <w:tr>
         <w:trPr>
           <w:trHeight w:val="20"/>
+          <w:ins w:id="15" w:author="Winston, Richard B" w:date="2025-06-01T10:08:00Z"/>
         </w:trPr>
         <w:tc>
           <w:tcPr>
@@ -1695,10 +2049,15 @@
           <w:p>
             <w:pPr>
               <w:pStyle w:val="TableCellBody"/>
-            </w:pPr>
-            <w:r>
-              <w:t>Time-Varying Storage Package</w:t>
-            </w:r>
+              <w:rPr>
+                <w:ins w:id="16" w:author="Winston, Richard B" w:date="2025-06-01T10:08:00Z"/>
+              </w:rPr>
+            </w:pPr>
+            <w:ins w:id="17" w:author="Winston, Richard B" w:date="2025-06-01T10:09:00Z">
+              <w:r>
+                <w:t>Output Control (OC) Option for GWT</w:t>
+              </w:r>
+            </w:ins>
           </w:p>
         </w:tc>
         <w:tc>
@@ -1708,10 +2067,18 @@
           <w:p>
             <w:pPr>
               <w:pStyle w:val="TableCellBody"/>
-            </w:pPr>
-            <w:r>
-              <w:t>supported</w:t>
-            </w:r>
+              <w:rPr>
+                <w:ins w:id="18" w:author="Winston, Richard B" w:date="2025-06-01T10:08:00Z"/>
+              </w:rPr>
+            </w:pPr>
+            <w:ins w:id="19" w:author="Winston, Richard B" w:date="2025-06-01T10:18:00Z">
+              <w:r>
+                <w:t>s</w:t>
+              </w:r>
+              <w:r>
+                <w:t>upported</w:t>
+              </w:r>
+            </w:ins>
           </w:p>
         </w:tc>
         <w:tc>
@@ -1722,6 +2089,9 @@
           <w:p>
             <w:pPr>
               <w:pStyle w:val="TableCellBody"/>
+              <w:rPr>
+                <w:ins w:id="20" w:author="Winston, Richard B" w:date="2025-06-01T10:08:00Z"/>
+              </w:rPr>
             </w:pPr>
           </w:p>
         </w:tc>
@@ -1729,6 +2099,7 @@
       <w:tr>
         <w:trPr>
           <w:trHeight w:val="20"/>
+          <w:ins w:id="21" w:author="Winston, Richard B" w:date="2025-06-01T10:08:00Z"/>
         </w:trPr>
         <w:tc>
           <w:tcPr>
@@ -1737,10 +2108,18 @@
           <w:p>
             <w:pPr>
               <w:pStyle w:val="TableCellBody"/>
-            </w:pPr>
-            <w:r>
-              <w:t>Buoyancy Package</w:t>
-            </w:r>
+              <w:rPr>
+                <w:ins w:id="22" w:author="Winston, Richard B" w:date="2025-06-01T10:08:00Z"/>
+              </w:rPr>
+            </w:pPr>
+            <w:ins w:id="23" w:author="Winston, Richard B" w:date="2025-06-01T10:10:00Z">
+              <w:r>
+                <w:t xml:space="preserve">Observation (OBS) Utility </w:t>
+              </w:r>
+              <w:r>
+                <w:t>for GWT</w:t>
+              </w:r>
+            </w:ins>
           </w:p>
         </w:tc>
         <w:tc>
@@ -1750,10 +2129,18 @@
           <w:p>
             <w:pPr>
               <w:pStyle w:val="TableCellBody"/>
-            </w:pPr>
-            <w:r>
-              <w:t>supported</w:t>
-            </w:r>
+              <w:rPr>
+                <w:ins w:id="24" w:author="Winston, Richard B" w:date="2025-06-01T10:08:00Z"/>
+              </w:rPr>
+            </w:pPr>
+            <w:ins w:id="25" w:author="Winston, Richard B" w:date="2025-06-01T10:18:00Z">
+              <w:r>
+                <w:t>s</w:t>
+              </w:r>
+              <w:r>
+                <w:t>upported</w:t>
+              </w:r>
+            </w:ins>
           </w:p>
         </w:tc>
         <w:tc>
@@ -1764,6 +2151,9 @@
           <w:p>
             <w:pPr>
               <w:pStyle w:val="TableCellBody"/>
+              <w:rPr>
+                <w:ins w:id="26" w:author="Winston, Richard B" w:date="2025-06-01T10:08:00Z"/>
+              </w:rPr>
             </w:pPr>
           </w:p>
         </w:tc>
@@ -1771,6 +2161,7 @@
       <w:tr>
         <w:trPr>
           <w:trHeight w:val="20"/>
+          <w:ins w:id="27" w:author="Winston, Richard B" w:date="2025-06-01T10:08:00Z"/>
         </w:trPr>
         <w:tc>
           <w:tcPr>
@@ -1779,10 +2170,18 @@
           <w:p>
             <w:pPr>
               <w:pStyle w:val="TableCellBody"/>
-            </w:pPr>
-            <w:r>
-              <w:t>Viscosity Package</w:t>
-            </w:r>
+              <w:rPr>
+                <w:ins w:id="28" w:author="Winston, Richard B" w:date="2025-06-01T10:08:00Z"/>
+              </w:rPr>
+            </w:pPr>
+            <w:ins w:id="29" w:author="Winston, Richard B" w:date="2025-06-01T10:10:00Z">
+              <w:r>
+                <w:t xml:space="preserve">Advection (ADV) Package </w:t>
+              </w:r>
+              <w:r>
+                <w:t>for GWT</w:t>
+              </w:r>
+            </w:ins>
           </w:p>
         </w:tc>
         <w:tc>
@@ -1792,10 +2191,18 @@
           <w:p>
             <w:pPr>
               <w:pStyle w:val="TableCellBody"/>
-            </w:pPr>
-            <w:r>
-              <w:t>supported</w:t>
-            </w:r>
+              <w:rPr>
+                <w:ins w:id="30" w:author="Winston, Richard B" w:date="2025-06-01T10:08:00Z"/>
+              </w:rPr>
+            </w:pPr>
+            <w:ins w:id="31" w:author="Winston, Richard B" w:date="2025-06-01T10:18:00Z">
+              <w:r>
+                <w:t>s</w:t>
+              </w:r>
+              <w:r>
+                <w:t>upported</w:t>
+              </w:r>
+            </w:ins>
           </w:p>
         </w:tc>
         <w:tc>
@@ -1806,6 +2213,9 @@
           <w:p>
             <w:pPr>
               <w:pStyle w:val="TableCellBody"/>
+              <w:rPr>
+                <w:ins w:id="32" w:author="Winston, Richard B" w:date="2025-06-01T10:08:00Z"/>
+              </w:rPr>
             </w:pPr>
           </w:p>
         </w:tc>
@@ -1813,6 +2223,7 @@
       <w:tr>
         <w:trPr>
           <w:trHeight w:val="20"/>
+          <w:ins w:id="33" w:author="Winston, Richard B" w:date="2025-06-01T10:08:00Z"/>
         </w:trPr>
         <w:tc>
           <w:tcPr>
@@ -1821,10 +2232,20 @@
           <w:p>
             <w:pPr>
               <w:pStyle w:val="TableCellBody"/>
-            </w:pPr>
-            <w:r>
-              <w:t>Groundwater Energy Transport (GWE)</w:t>
-            </w:r>
+              <w:rPr>
+                <w:ins w:id="34" w:author="Winston, Richard B" w:date="2025-06-01T10:08:00Z"/>
+              </w:rPr>
+            </w:pPr>
+            <w:ins w:id="35" w:author="Winston, Richard B" w:date="2025-06-01T10:11:00Z">
+              <w:r>
+                <w:t xml:space="preserve">Dispersion (DSP Package </w:t>
+              </w:r>
+            </w:ins>
+            <w:ins w:id="36" w:author="Winston, Richard B" w:date="2025-06-01T10:10:00Z">
+              <w:r>
+                <w:t>for GWT</w:t>
+              </w:r>
+            </w:ins>
           </w:p>
         </w:tc>
         <w:tc>
@@ -1834,10 +2255,18 @@
           <w:p>
             <w:pPr>
               <w:pStyle w:val="TableCellBody"/>
-            </w:pPr>
-            <w:r>
-              <w:t>supported</w:t>
-            </w:r>
+              <w:rPr>
+                <w:ins w:id="37" w:author="Winston, Richard B" w:date="2025-06-01T10:08:00Z"/>
+              </w:rPr>
+            </w:pPr>
+            <w:ins w:id="38" w:author="Winston, Richard B" w:date="2025-06-01T10:18:00Z">
+              <w:r>
+                <w:t>s</w:t>
+              </w:r>
+              <w:r>
+                <w:t>upported</w:t>
+              </w:r>
+            </w:ins>
           </w:p>
         </w:tc>
         <w:tc>
@@ -1848,6 +2277,9 @@
           <w:p>
             <w:pPr>
               <w:pStyle w:val="TableCellBody"/>
+              <w:rPr>
+                <w:ins w:id="39" w:author="Winston, Richard B" w:date="2025-06-01T10:08:00Z"/>
+              </w:rPr>
             </w:pPr>
           </w:p>
         </w:tc>
@@ -1855,6 +2287,7 @@
       <w:tr>
         <w:trPr>
           <w:trHeight w:val="20"/>
+          <w:ins w:id="40" w:author="Winston, Richard B" w:date="2025-06-01T10:08:00Z"/>
         </w:trPr>
         <w:tc>
           <w:tcPr>
@@ -1863,10 +2296,20 @@
           <w:p>
             <w:pPr>
               <w:pStyle w:val="TableCellBody"/>
-            </w:pPr>
-            <w:r>
-              <w:t>Particle Tracking (PRT)</w:t>
-            </w:r>
+              <w:rPr>
+                <w:ins w:id="41" w:author="Winston, Richard B" w:date="2025-06-01T10:08:00Z"/>
+              </w:rPr>
+            </w:pPr>
+            <w:ins w:id="42" w:author="Winston, Richard B" w:date="2025-06-01T10:11:00Z">
+              <w:r>
+                <w:t xml:space="preserve">Source and Sink Mixing (SSM) Package </w:t>
+              </w:r>
+            </w:ins>
+            <w:ins w:id="43" w:author="Winston, Richard B" w:date="2025-06-01T10:10:00Z">
+              <w:r>
+                <w:t>for GWT</w:t>
+              </w:r>
+            </w:ins>
           </w:p>
         </w:tc>
         <w:tc>
@@ -1876,13 +2319,18 @@
           <w:p>
             <w:pPr>
               <w:pStyle w:val="TableCellBody"/>
-            </w:pPr>
-            <w:r>
-              <w:t xml:space="preserve">not </w:t>
-            </w:r>
-            <w:r>
-              <w:t>supported</w:t>
-            </w:r>
+              <w:rPr>
+                <w:ins w:id="44" w:author="Winston, Richard B" w:date="2025-06-01T10:08:00Z"/>
+              </w:rPr>
+            </w:pPr>
+            <w:ins w:id="45" w:author="Winston, Richard B" w:date="2025-06-01T10:18:00Z">
+              <w:r>
+                <w:t>s</w:t>
+              </w:r>
+              <w:r>
+                <w:t>upported</w:t>
+              </w:r>
+            </w:ins>
           </w:p>
         </w:tc>
         <w:tc>
@@ -1893,6 +2341,9 @@
           <w:p>
             <w:pPr>
               <w:pStyle w:val="TableCellBody"/>
+              <w:rPr>
+                <w:ins w:id="46" w:author="Winston, Richard B" w:date="2025-06-01T10:08:00Z"/>
+              </w:rPr>
             </w:pPr>
           </w:p>
         </w:tc>
@@ -1900,6 +2351,7 @@
       <w:tr>
         <w:trPr>
           <w:trHeight w:val="20"/>
+          <w:ins w:id="47" w:author="Winston, Richard B" w:date="2025-06-01T10:08:00Z"/>
         </w:trPr>
         <w:tc>
           <w:tcPr>
@@ -1908,10 +2360,28 @@
           <w:p>
             <w:pPr>
               <w:pStyle w:val="TableCellBody"/>
-            </w:pPr>
-            <w:r>
-              <w:t>AUXMULTNAME</w:t>
-            </w:r>
+              <w:keepNext/>
+              <w:ind w:left="187" w:hanging="187"/>
+              <w:rPr>
+                <w:ins w:id="48" w:author="Winston, Richard B" w:date="2025-06-01T10:08:00Z"/>
+              </w:rPr>
+              <w:pPrChange w:id="49" w:author="Winston, Richard B" w:date="2025-06-01T10:13:00Z">
+                <w:pPr>
+                  <w:pStyle w:val="TableCellBody"/>
+                </w:pPr>
+              </w:pPrChange>
+            </w:pPr>
+            <w:ins w:id="50" w:author="Winston, Richard B" w:date="2025-06-01T10:12:00Z">
+              <w:r>
+                <w:lastRenderedPageBreak/>
+                <w:t xml:space="preserve">Mobile Storage and Transfer (MST) Package </w:t>
+              </w:r>
+            </w:ins>
+            <w:ins w:id="51" w:author="Winston, Richard B" w:date="2025-06-01T10:10:00Z">
+              <w:r>
+                <w:t>for GWT</w:t>
+              </w:r>
+            </w:ins>
           </w:p>
         </w:tc>
         <w:tc>
@@ -1921,10 +2391,18 @@
           <w:p>
             <w:pPr>
               <w:pStyle w:val="TableCellBody"/>
-            </w:pPr>
-            <w:r>
-              <w:t>supported</w:t>
-            </w:r>
+              <w:rPr>
+                <w:ins w:id="52" w:author="Winston, Richard B" w:date="2025-06-01T10:08:00Z"/>
+              </w:rPr>
+            </w:pPr>
+            <w:ins w:id="53" w:author="Winston, Richard B" w:date="2025-06-01T10:18:00Z">
+              <w:r>
+                <w:t>s</w:t>
+              </w:r>
+              <w:r>
+                <w:t>upported</w:t>
+              </w:r>
+            </w:ins>
           </w:p>
         </w:tc>
         <w:tc>
@@ -1935,6 +2413,1766 @@
           <w:p>
             <w:pPr>
               <w:pStyle w:val="TableCellBody"/>
+              <w:rPr>
+                <w:ins w:id="54" w:author="Winston, Richard B" w:date="2025-06-01T10:08:00Z"/>
+              </w:rPr>
+            </w:pPr>
+          </w:p>
+        </w:tc>
+      </w:tr>
+      <w:tr>
+        <w:trPr>
+          <w:trHeight w:val="20"/>
+          <w:ins w:id="55" w:author="Winston, Richard B" w:date="2025-06-01T10:11:00Z"/>
+        </w:trPr>
+        <w:tc>
+          <w:tcPr>
+            <w:tcW w:w="4050" w:type="dxa"/>
+          </w:tcPr>
+          <w:p>
+            <w:pPr>
+              <w:pStyle w:val="TableCellBody"/>
+              <w:rPr>
+                <w:ins w:id="56" w:author="Winston, Richard B" w:date="2025-06-01T10:11:00Z"/>
+              </w:rPr>
+            </w:pPr>
+            <w:ins w:id="57" w:author="Winston, Richard B" w:date="2025-06-01T10:13:00Z">
+              <w:r>
+                <w:t>Imm</w:t>
+              </w:r>
+              <w:r>
+                <w:t>obile Storage and Transfer (</w:t>
+              </w:r>
+              <w:r>
+                <w:t>I</w:t>
+              </w:r>
+              <w:r>
+                <w:t xml:space="preserve">ST) Package </w:t>
+              </w:r>
+            </w:ins>
+            <w:ins w:id="58" w:author="Winston, Richard B" w:date="2025-06-01T10:11:00Z">
+              <w:r>
+                <w:t>for GWT</w:t>
+              </w:r>
+            </w:ins>
+          </w:p>
+        </w:tc>
+        <w:tc>
+          <w:tcPr>
+            <w:tcW w:w="1440" w:type="dxa"/>
+          </w:tcPr>
+          <w:p>
+            <w:pPr>
+              <w:pStyle w:val="TableCellBody"/>
+              <w:rPr>
+                <w:ins w:id="59" w:author="Winston, Richard B" w:date="2025-06-01T10:11:00Z"/>
+              </w:rPr>
+            </w:pPr>
+            <w:ins w:id="60" w:author="Winston, Richard B" w:date="2025-06-01T10:18:00Z">
+              <w:r>
+                <w:t>s</w:t>
+              </w:r>
+              <w:r>
+                <w:t>upported</w:t>
+              </w:r>
+            </w:ins>
+          </w:p>
+        </w:tc>
+        <w:tc>
+          <w:tcPr>
+            <w:tcW w:w="3870" w:type="dxa"/>
+            <w:vAlign w:val="center"/>
+          </w:tcPr>
+          <w:p>
+            <w:pPr>
+              <w:pStyle w:val="TableCellBody"/>
+              <w:rPr>
+                <w:ins w:id="61" w:author="Winston, Richard B" w:date="2025-06-01T10:11:00Z"/>
+              </w:rPr>
+            </w:pPr>
+          </w:p>
+        </w:tc>
+      </w:tr>
+      <w:tr>
+        <w:trPr>
+          <w:trHeight w:val="20"/>
+          <w:ins w:id="62" w:author="Winston, Richard B" w:date="2025-06-01T10:11:00Z"/>
+        </w:trPr>
+        <w:tc>
+          <w:tcPr>
+            <w:tcW w:w="4050" w:type="dxa"/>
+          </w:tcPr>
+          <w:p>
+            <w:pPr>
+              <w:pStyle w:val="TableCellBody"/>
+              <w:rPr>
+                <w:ins w:id="63" w:author="Winston, Richard B" w:date="2025-06-01T10:11:00Z"/>
+              </w:rPr>
+            </w:pPr>
+            <w:ins w:id="64" w:author="Winston, Richard B" w:date="2025-06-01T10:13:00Z">
+              <w:r>
+                <w:t>Constant Concentrati</w:t>
+              </w:r>
+            </w:ins>
+            <w:ins w:id="65" w:author="Winston, Richard B" w:date="2025-06-01T10:14:00Z">
+              <w:r>
+                <w:t xml:space="preserve">on (CNC) Package </w:t>
+              </w:r>
+            </w:ins>
+            <w:ins w:id="66" w:author="Winston, Richard B" w:date="2025-06-01T10:11:00Z">
+              <w:r>
+                <w:t>for GWT</w:t>
+              </w:r>
+            </w:ins>
+          </w:p>
+        </w:tc>
+        <w:tc>
+          <w:tcPr>
+            <w:tcW w:w="1440" w:type="dxa"/>
+          </w:tcPr>
+          <w:p>
+            <w:pPr>
+              <w:pStyle w:val="TableCellBody"/>
+              <w:rPr>
+                <w:ins w:id="67" w:author="Winston, Richard B" w:date="2025-06-01T10:11:00Z"/>
+              </w:rPr>
+            </w:pPr>
+            <w:ins w:id="68" w:author="Winston, Richard B" w:date="2025-06-01T10:18:00Z">
+              <w:r>
+                <w:t>s</w:t>
+              </w:r>
+              <w:r>
+                <w:t>upported</w:t>
+              </w:r>
+            </w:ins>
+          </w:p>
+        </w:tc>
+        <w:tc>
+          <w:tcPr>
+            <w:tcW w:w="3870" w:type="dxa"/>
+            <w:vAlign w:val="center"/>
+          </w:tcPr>
+          <w:p>
+            <w:pPr>
+              <w:pStyle w:val="TableCellBody"/>
+              <w:rPr>
+                <w:ins w:id="69" w:author="Winston, Richard B" w:date="2025-06-01T10:11:00Z"/>
+              </w:rPr>
+            </w:pPr>
+          </w:p>
+        </w:tc>
+      </w:tr>
+      <w:tr>
+        <w:trPr>
+          <w:trHeight w:val="20"/>
+          <w:ins w:id="70" w:author="Winston, Richard B" w:date="2025-06-01T10:11:00Z"/>
+        </w:trPr>
+        <w:tc>
+          <w:tcPr>
+            <w:tcW w:w="4050" w:type="dxa"/>
+          </w:tcPr>
+          <w:p>
+            <w:pPr>
+              <w:pStyle w:val="TableCellBody"/>
+              <w:rPr>
+                <w:ins w:id="71" w:author="Winston, Richard B" w:date="2025-06-01T10:11:00Z"/>
+              </w:rPr>
+            </w:pPr>
+            <w:ins w:id="72" w:author="Winston, Richard B" w:date="2025-06-01T10:14:00Z">
+              <w:r>
+                <w:t xml:space="preserve">Mass Source Loading (SRC) Package </w:t>
+              </w:r>
+            </w:ins>
+            <w:ins w:id="73" w:author="Winston, Richard B" w:date="2025-06-01T10:11:00Z">
+              <w:r>
+                <w:t>for GWT</w:t>
+              </w:r>
+            </w:ins>
+          </w:p>
+        </w:tc>
+        <w:tc>
+          <w:tcPr>
+            <w:tcW w:w="1440" w:type="dxa"/>
+          </w:tcPr>
+          <w:p>
+            <w:pPr>
+              <w:pStyle w:val="TableCellBody"/>
+              <w:rPr>
+                <w:ins w:id="74" w:author="Winston, Richard B" w:date="2025-06-01T10:11:00Z"/>
+              </w:rPr>
+            </w:pPr>
+            <w:ins w:id="75" w:author="Winston, Richard B" w:date="2025-06-01T10:18:00Z">
+              <w:r>
+                <w:t>s</w:t>
+              </w:r>
+              <w:r>
+                <w:t>upported</w:t>
+              </w:r>
+            </w:ins>
+          </w:p>
+        </w:tc>
+        <w:tc>
+          <w:tcPr>
+            <w:tcW w:w="3870" w:type="dxa"/>
+            <w:vAlign w:val="center"/>
+          </w:tcPr>
+          <w:p>
+            <w:pPr>
+              <w:pStyle w:val="TableCellBody"/>
+              <w:rPr>
+                <w:ins w:id="76" w:author="Winston, Richard B" w:date="2025-06-01T10:11:00Z"/>
+              </w:rPr>
+            </w:pPr>
+          </w:p>
+        </w:tc>
+      </w:tr>
+      <w:tr>
+        <w:trPr>
+          <w:trHeight w:val="20"/>
+          <w:ins w:id="77" w:author="Winston, Richard B" w:date="2025-06-01T10:11:00Z"/>
+        </w:trPr>
+        <w:tc>
+          <w:tcPr>
+            <w:tcW w:w="4050" w:type="dxa"/>
+          </w:tcPr>
+          <w:p>
+            <w:pPr>
+              <w:pStyle w:val="TableCellBody"/>
+              <w:rPr>
+                <w:ins w:id="78" w:author="Winston, Richard B" w:date="2025-06-01T10:11:00Z"/>
+              </w:rPr>
+            </w:pPr>
+            <w:ins w:id="79" w:author="Winston, Richard B" w:date="2025-06-01T10:15:00Z">
+              <w:r>
+                <w:t xml:space="preserve">Streamflow Transport (SFT) Package </w:t>
+              </w:r>
+            </w:ins>
+            <w:ins w:id="80" w:author="Winston, Richard B" w:date="2025-06-01T10:12:00Z">
+              <w:r>
+                <w:t>for GWT</w:t>
+              </w:r>
+            </w:ins>
+          </w:p>
+        </w:tc>
+        <w:tc>
+          <w:tcPr>
+            <w:tcW w:w="1440" w:type="dxa"/>
+          </w:tcPr>
+          <w:p>
+            <w:pPr>
+              <w:pStyle w:val="TableCellBody"/>
+              <w:rPr>
+                <w:ins w:id="81" w:author="Winston, Richard B" w:date="2025-06-01T10:11:00Z"/>
+              </w:rPr>
+            </w:pPr>
+            <w:ins w:id="82" w:author="Winston, Richard B" w:date="2025-06-01T10:18:00Z">
+              <w:r>
+                <w:t>s</w:t>
+              </w:r>
+              <w:r>
+                <w:t>upported</w:t>
+              </w:r>
+            </w:ins>
+          </w:p>
+        </w:tc>
+        <w:tc>
+          <w:tcPr>
+            <w:tcW w:w="3870" w:type="dxa"/>
+            <w:vAlign w:val="center"/>
+          </w:tcPr>
+          <w:p>
+            <w:pPr>
+              <w:pStyle w:val="TableCellBody"/>
+              <w:rPr>
+                <w:ins w:id="83" w:author="Winston, Richard B" w:date="2025-06-01T10:11:00Z"/>
+              </w:rPr>
+            </w:pPr>
+          </w:p>
+        </w:tc>
+      </w:tr>
+      <w:tr>
+        <w:trPr>
+          <w:trHeight w:val="20"/>
+          <w:ins w:id="84" w:author="Winston, Richard B" w:date="2025-06-01T10:14:00Z"/>
+        </w:trPr>
+        <w:tc>
+          <w:tcPr>
+            <w:tcW w:w="4050" w:type="dxa"/>
+          </w:tcPr>
+          <w:p>
+            <w:pPr>
+              <w:pStyle w:val="TableCellBody"/>
+              <w:rPr>
+                <w:ins w:id="85" w:author="Winston, Richard B" w:date="2025-06-01T10:14:00Z"/>
+              </w:rPr>
+            </w:pPr>
+            <w:ins w:id="86" w:author="Winston, Richard B" w:date="2025-06-01T10:15:00Z">
+              <w:r>
+                <w:t>Lake</w:t>
+              </w:r>
+              <w:r>
+                <w:t xml:space="preserve"> Transport (</w:t>
+              </w:r>
+              <w:r>
+                <w:t>LK</w:t>
+              </w:r>
+              <w:r>
+                <w:t>T) Package for GWT</w:t>
+              </w:r>
+            </w:ins>
+          </w:p>
+        </w:tc>
+        <w:tc>
+          <w:tcPr>
+            <w:tcW w:w="1440" w:type="dxa"/>
+          </w:tcPr>
+          <w:p>
+            <w:pPr>
+              <w:pStyle w:val="TableCellBody"/>
+              <w:rPr>
+                <w:ins w:id="87" w:author="Winston, Richard B" w:date="2025-06-01T10:14:00Z"/>
+              </w:rPr>
+            </w:pPr>
+            <w:ins w:id="88" w:author="Winston, Richard B" w:date="2025-06-01T10:18:00Z">
+              <w:r>
+                <w:t>s</w:t>
+              </w:r>
+              <w:r>
+                <w:t>upported</w:t>
+              </w:r>
+            </w:ins>
+          </w:p>
+        </w:tc>
+        <w:tc>
+          <w:tcPr>
+            <w:tcW w:w="3870" w:type="dxa"/>
+            <w:vAlign w:val="center"/>
+          </w:tcPr>
+          <w:p>
+            <w:pPr>
+              <w:pStyle w:val="TableCellBody"/>
+              <w:rPr>
+                <w:ins w:id="89" w:author="Winston, Richard B" w:date="2025-06-01T10:14:00Z"/>
+              </w:rPr>
+            </w:pPr>
+          </w:p>
+        </w:tc>
+      </w:tr>
+      <w:tr>
+        <w:trPr>
+          <w:trHeight w:val="20"/>
+          <w:ins w:id="90" w:author="Winston, Richard B" w:date="2025-06-01T10:14:00Z"/>
+        </w:trPr>
+        <w:tc>
+          <w:tcPr>
+            <w:tcW w:w="4050" w:type="dxa"/>
+          </w:tcPr>
+          <w:p>
+            <w:pPr>
+              <w:pStyle w:val="TableCellBody"/>
+              <w:rPr>
+                <w:ins w:id="91" w:author="Winston, Richard B" w:date="2025-06-01T10:14:00Z"/>
+              </w:rPr>
+            </w:pPr>
+            <w:ins w:id="92" w:author="Winston, Richard B" w:date="2025-06-01T10:16:00Z">
+              <w:r>
+                <w:t>Multi-Aquifer Well</w:t>
+              </w:r>
+            </w:ins>
+            <w:ins w:id="93" w:author="Winston, Richard B" w:date="2025-06-01T10:15:00Z">
+              <w:r>
+                <w:t xml:space="preserve"> Transport (</w:t>
+              </w:r>
+            </w:ins>
+            <w:ins w:id="94" w:author="Winston, Richard B" w:date="2025-06-01T10:16:00Z">
+              <w:r>
+                <w:t>MWT</w:t>
+              </w:r>
+            </w:ins>
+            <w:ins w:id="95" w:author="Winston, Richard B" w:date="2025-06-01T10:15:00Z">
+              <w:r>
+                <w:t>) Package for GWT</w:t>
+              </w:r>
+            </w:ins>
+          </w:p>
+        </w:tc>
+        <w:tc>
+          <w:tcPr>
+            <w:tcW w:w="1440" w:type="dxa"/>
+          </w:tcPr>
+          <w:p>
+            <w:pPr>
+              <w:pStyle w:val="TableCellBody"/>
+              <w:rPr>
+                <w:ins w:id="96" w:author="Winston, Richard B" w:date="2025-06-01T10:14:00Z"/>
+              </w:rPr>
+            </w:pPr>
+            <w:ins w:id="97" w:author="Winston, Richard B" w:date="2025-06-01T10:19:00Z">
+              <w:r>
+                <w:t>s</w:t>
+              </w:r>
+              <w:r>
+                <w:t>upported</w:t>
+              </w:r>
+            </w:ins>
+          </w:p>
+        </w:tc>
+        <w:tc>
+          <w:tcPr>
+            <w:tcW w:w="3870" w:type="dxa"/>
+            <w:vAlign w:val="center"/>
+          </w:tcPr>
+          <w:p>
+            <w:pPr>
+              <w:pStyle w:val="TableCellBody"/>
+              <w:rPr>
+                <w:ins w:id="98" w:author="Winston, Richard B" w:date="2025-06-01T10:14:00Z"/>
+              </w:rPr>
+            </w:pPr>
+          </w:p>
+        </w:tc>
+      </w:tr>
+      <w:tr>
+        <w:trPr>
+          <w:trHeight w:val="20"/>
+          <w:ins w:id="99" w:author="Winston, Richard B" w:date="2025-06-01T10:14:00Z"/>
+        </w:trPr>
+        <w:tc>
+          <w:tcPr>
+            <w:tcW w:w="4050" w:type="dxa"/>
+          </w:tcPr>
+          <w:p>
+            <w:pPr>
+              <w:pStyle w:val="TableCellBody"/>
+              <w:rPr>
+                <w:ins w:id="100" w:author="Winston, Richard B" w:date="2025-06-01T10:14:00Z"/>
+              </w:rPr>
+            </w:pPr>
+            <w:ins w:id="101" w:author="Winston, Richard B" w:date="2025-06-01T10:16:00Z">
+              <w:r>
+                <w:t>Unsaturated Zone</w:t>
+              </w:r>
+              <w:r>
+                <w:t xml:space="preserve"> Transport (</w:t>
+              </w:r>
+              <w:r>
+                <w:t>UZT</w:t>
+              </w:r>
+              <w:r>
+                <w:t>)</w:t>
+              </w:r>
+              <w:r>
+                <w:t xml:space="preserve"> </w:t>
+              </w:r>
+            </w:ins>
+            <w:ins w:id="102" w:author="Winston, Richard B" w:date="2025-06-01T10:15:00Z">
+              <w:r>
+                <w:t>Package for GWT</w:t>
+              </w:r>
+            </w:ins>
+          </w:p>
+        </w:tc>
+        <w:tc>
+          <w:tcPr>
+            <w:tcW w:w="1440" w:type="dxa"/>
+          </w:tcPr>
+          <w:p>
+            <w:pPr>
+              <w:pStyle w:val="TableCellBody"/>
+              <w:rPr>
+                <w:ins w:id="103" w:author="Winston, Richard B" w:date="2025-06-01T10:14:00Z"/>
+              </w:rPr>
+            </w:pPr>
+            <w:ins w:id="104" w:author="Winston, Richard B" w:date="2025-06-01T10:19:00Z">
+              <w:r>
+                <w:t>s</w:t>
+              </w:r>
+              <w:r>
+                <w:t>upported</w:t>
+              </w:r>
+            </w:ins>
+          </w:p>
+        </w:tc>
+        <w:tc>
+          <w:tcPr>
+            <w:tcW w:w="3870" w:type="dxa"/>
+            <w:vAlign w:val="center"/>
+          </w:tcPr>
+          <w:p>
+            <w:pPr>
+              <w:pStyle w:val="TableCellBody"/>
+              <w:rPr>
+                <w:ins w:id="105" w:author="Winston, Richard B" w:date="2025-06-01T10:14:00Z"/>
+              </w:rPr>
+            </w:pPr>
+          </w:p>
+        </w:tc>
+      </w:tr>
+      <w:tr>
+        <w:trPr>
+          <w:trHeight w:val="20"/>
+          <w:ins w:id="106" w:author="Winston, Richard B" w:date="2025-06-01T10:14:00Z"/>
+        </w:trPr>
+        <w:tc>
+          <w:tcPr>
+            <w:tcW w:w="4050" w:type="dxa"/>
+          </w:tcPr>
+          <w:p>
+            <w:pPr>
+              <w:pStyle w:val="TableCellBody"/>
+              <w:rPr>
+                <w:ins w:id="107" w:author="Winston, Richard B" w:date="2025-06-01T10:14:00Z"/>
+              </w:rPr>
+            </w:pPr>
+            <w:ins w:id="108" w:author="Winston, Richard B" w:date="2025-06-01T10:17:00Z">
+              <w:r>
+                <w:t xml:space="preserve">Flow Model Interface (FMI) </w:t>
+              </w:r>
+            </w:ins>
+            <w:ins w:id="109" w:author="Winston, Richard B" w:date="2025-06-01T10:15:00Z">
+              <w:r>
+                <w:t>Package for GWT</w:t>
+              </w:r>
+            </w:ins>
+          </w:p>
+        </w:tc>
+        <w:tc>
+          <w:tcPr>
+            <w:tcW w:w="1440" w:type="dxa"/>
+          </w:tcPr>
+          <w:p>
+            <w:pPr>
+              <w:pStyle w:val="TableCellBody"/>
+              <w:rPr>
+                <w:ins w:id="110" w:author="Winston, Richard B" w:date="2025-06-01T10:14:00Z"/>
+              </w:rPr>
+            </w:pPr>
+            <w:ins w:id="111" w:author="Winston, Richard B" w:date="2025-06-01T10:19:00Z">
+              <w:r>
+                <w:t>s</w:t>
+              </w:r>
+              <w:r>
+                <w:t>upported</w:t>
+              </w:r>
+            </w:ins>
+          </w:p>
+        </w:tc>
+        <w:tc>
+          <w:tcPr>
+            <w:tcW w:w="3870" w:type="dxa"/>
+            <w:vAlign w:val="center"/>
+          </w:tcPr>
+          <w:p>
+            <w:pPr>
+              <w:pStyle w:val="TableCellBody"/>
+              <w:rPr>
+                <w:ins w:id="112" w:author="Winston, Richard B" w:date="2025-06-01T10:14:00Z"/>
+              </w:rPr>
+            </w:pPr>
+          </w:p>
+        </w:tc>
+      </w:tr>
+      <w:tr>
+        <w:trPr>
+          <w:trHeight w:val="20"/>
+          <w:ins w:id="113" w:author="Winston, Richard B" w:date="2025-06-01T10:14:00Z"/>
+        </w:trPr>
+        <w:tc>
+          <w:tcPr>
+            <w:tcW w:w="4050" w:type="dxa"/>
+          </w:tcPr>
+          <w:p>
+            <w:pPr>
+              <w:pStyle w:val="TableCellBody"/>
+              <w:rPr>
+                <w:ins w:id="114" w:author="Winston, Richard B" w:date="2025-06-01T10:14:00Z"/>
+              </w:rPr>
+            </w:pPr>
+            <w:ins w:id="115" w:author="Winston, Richard B" w:date="2025-06-01T10:17:00Z">
+              <w:r>
+                <w:t xml:space="preserve">Mover Transport (MVT) </w:t>
+              </w:r>
+            </w:ins>
+            <w:ins w:id="116" w:author="Winston, Richard B" w:date="2025-06-01T10:15:00Z">
+              <w:r>
+                <w:t>Package for GWT</w:t>
+              </w:r>
+            </w:ins>
+          </w:p>
+        </w:tc>
+        <w:tc>
+          <w:tcPr>
+            <w:tcW w:w="1440" w:type="dxa"/>
+          </w:tcPr>
+          <w:p>
+            <w:pPr>
+              <w:pStyle w:val="TableCellBody"/>
+              <w:rPr>
+                <w:ins w:id="117" w:author="Winston, Richard B" w:date="2025-06-01T10:14:00Z"/>
+              </w:rPr>
+            </w:pPr>
+            <w:ins w:id="118" w:author="Winston, Richard B" w:date="2025-06-01T10:19:00Z">
+              <w:r>
+                <w:t>s</w:t>
+              </w:r>
+              <w:r>
+                <w:t>upported</w:t>
+              </w:r>
+            </w:ins>
+          </w:p>
+        </w:tc>
+        <w:tc>
+          <w:tcPr>
+            <w:tcW w:w="3870" w:type="dxa"/>
+            <w:vAlign w:val="center"/>
+          </w:tcPr>
+          <w:p>
+            <w:pPr>
+              <w:pStyle w:val="TableCellBody"/>
+              <w:rPr>
+                <w:ins w:id="119" w:author="Winston, Richard B" w:date="2025-06-01T10:14:00Z"/>
+              </w:rPr>
+            </w:pPr>
+          </w:p>
+        </w:tc>
+      </w:tr>
+      <w:tr>
+        <w:trPr>
+          <w:trHeight w:val="20"/>
+          <w:ins w:id="120" w:author="Winston, Richard B" w:date="2025-06-01T10:06:00Z"/>
+        </w:trPr>
+        <w:tc>
+          <w:tcPr>
+            <w:tcW w:w="4050" w:type="dxa"/>
+          </w:tcPr>
+          <w:p>
+            <w:pPr>
+              <w:pStyle w:val="TableCellBody"/>
+              <w:rPr>
+                <w:ins w:id="121" w:author="Winston, Richard B" w:date="2025-06-01T10:06:00Z"/>
+              </w:rPr>
+            </w:pPr>
+            <w:ins w:id="122" w:author="Winston, Richard B" w:date="2025-06-01T10:06:00Z">
+              <w:r>
+                <w:t>Groundwater (Solute) Transport Exchange</w:t>
+              </w:r>
+            </w:ins>
+          </w:p>
+        </w:tc>
+        <w:tc>
+          <w:tcPr>
+            <w:tcW w:w="1440" w:type="dxa"/>
+          </w:tcPr>
+          <w:p>
+            <w:pPr>
+              <w:pStyle w:val="TableCellBody"/>
+              <w:rPr>
+                <w:ins w:id="123" w:author="Winston, Richard B" w:date="2025-06-01T10:06:00Z"/>
+              </w:rPr>
+            </w:pPr>
+            <w:ins w:id="124" w:author="Winston, Richard B" w:date="2025-06-01T10:06:00Z">
+              <w:r>
+                <w:t xml:space="preserve">not </w:t>
+              </w:r>
+              <w:r>
+                <w:t>supported</w:t>
+              </w:r>
+            </w:ins>
+          </w:p>
+        </w:tc>
+        <w:tc>
+          <w:tcPr>
+            <w:tcW w:w="3870" w:type="dxa"/>
+            <w:vAlign w:val="center"/>
+          </w:tcPr>
+          <w:p>
+            <w:pPr>
+              <w:pStyle w:val="TableCellBody"/>
+              <w:rPr>
+                <w:ins w:id="125" w:author="Winston, Richard B" w:date="2025-06-01T10:06:00Z"/>
+              </w:rPr>
+            </w:pPr>
+          </w:p>
+        </w:tc>
+      </w:tr>
+      <w:tr>
+        <w:trPr>
+          <w:trHeight w:val="20"/>
+          <w:ins w:id="126" w:author="Winston, Richard B" w:date="2025-06-01T10:17:00Z"/>
+        </w:trPr>
+        <w:tc>
+          <w:tcPr>
+            <w:tcW w:w="4050" w:type="dxa"/>
+          </w:tcPr>
+          <w:p>
+            <w:pPr>
+              <w:pStyle w:val="TableCellBody"/>
+              <w:rPr>
+                <w:ins w:id="127" w:author="Winston, Richard B" w:date="2025-06-01T10:17:00Z"/>
+              </w:rPr>
+            </w:pPr>
+            <w:ins w:id="128" w:author="Winston, Richard B" w:date="2025-06-01T10:19:00Z">
+              <w:r>
+                <w:t xml:space="preserve">Initial Conditions (IC) for Groundwater </w:t>
+              </w:r>
+              <w:r>
+                <w:t>E</w:t>
+              </w:r>
+            </w:ins>
+            <w:ins w:id="129" w:author="Winston, Richard B" w:date="2025-06-01T10:20:00Z">
+              <w:r>
+                <w:t>nergy</w:t>
+              </w:r>
+            </w:ins>
+            <w:ins w:id="130" w:author="Winston, Richard B" w:date="2025-06-01T10:19:00Z">
+              <w:r>
+                <w:t xml:space="preserve"> Transport GW</w:t>
+              </w:r>
+            </w:ins>
+            <w:ins w:id="131" w:author="Winston, Richard B" w:date="2025-06-01T10:20:00Z">
+              <w:r>
+                <w:t>E</w:t>
+              </w:r>
+            </w:ins>
+          </w:p>
+        </w:tc>
+        <w:tc>
+          <w:tcPr>
+            <w:tcW w:w="1440" w:type="dxa"/>
+          </w:tcPr>
+          <w:p>
+            <w:pPr>
+              <w:pStyle w:val="TableCellBody"/>
+              <w:rPr>
+                <w:ins w:id="132" w:author="Winston, Richard B" w:date="2025-06-01T10:17:00Z"/>
+              </w:rPr>
+            </w:pPr>
+            <w:ins w:id="133" w:author="Winston, Richard B" w:date="2025-06-01T10:19:00Z">
+              <w:r>
+                <w:t>supported</w:t>
+              </w:r>
+            </w:ins>
+          </w:p>
+        </w:tc>
+        <w:tc>
+          <w:tcPr>
+            <w:tcW w:w="3870" w:type="dxa"/>
+            <w:vAlign w:val="center"/>
+          </w:tcPr>
+          <w:p>
+            <w:pPr>
+              <w:pStyle w:val="TableCellBody"/>
+              <w:rPr>
+                <w:ins w:id="134" w:author="Winston, Richard B" w:date="2025-06-01T10:17:00Z"/>
+              </w:rPr>
+            </w:pPr>
+          </w:p>
+        </w:tc>
+      </w:tr>
+      <w:tr>
+        <w:trPr>
+          <w:trHeight w:val="20"/>
+          <w:ins w:id="135" w:author="Winston, Richard B" w:date="2025-06-01T10:17:00Z"/>
+        </w:trPr>
+        <w:tc>
+          <w:tcPr>
+            <w:tcW w:w="4050" w:type="dxa"/>
+          </w:tcPr>
+          <w:p>
+            <w:pPr>
+              <w:pStyle w:val="TableCellBody"/>
+              <w:rPr>
+                <w:ins w:id="136" w:author="Winston, Richard B" w:date="2025-06-01T10:17:00Z"/>
+              </w:rPr>
+            </w:pPr>
+            <w:ins w:id="137" w:author="Winston, Richard B" w:date="2025-06-01T10:20:00Z">
+              <w:r>
+                <w:t>Output Control (OC) Option for GW</w:t>
+              </w:r>
+              <w:r>
+                <w:t>E</w:t>
+              </w:r>
+            </w:ins>
+          </w:p>
+        </w:tc>
+        <w:tc>
+          <w:tcPr>
+            <w:tcW w:w="1440" w:type="dxa"/>
+          </w:tcPr>
+          <w:p>
+            <w:pPr>
+              <w:pStyle w:val="TableCellBody"/>
+              <w:rPr>
+                <w:ins w:id="138" w:author="Winston, Richard B" w:date="2025-06-01T10:17:00Z"/>
+              </w:rPr>
+            </w:pPr>
+            <w:ins w:id="139" w:author="Winston, Richard B" w:date="2025-06-01T10:20:00Z">
+              <w:r>
+                <w:t>s</w:t>
+              </w:r>
+              <w:r>
+                <w:t>upported</w:t>
+              </w:r>
+            </w:ins>
+          </w:p>
+        </w:tc>
+        <w:tc>
+          <w:tcPr>
+            <w:tcW w:w="3870" w:type="dxa"/>
+            <w:vAlign w:val="center"/>
+          </w:tcPr>
+          <w:p>
+            <w:pPr>
+              <w:pStyle w:val="TableCellBody"/>
+              <w:rPr>
+                <w:ins w:id="140" w:author="Winston, Richard B" w:date="2025-06-01T10:17:00Z"/>
+              </w:rPr>
+            </w:pPr>
+          </w:p>
+        </w:tc>
+      </w:tr>
+      <w:tr>
+        <w:trPr>
+          <w:trHeight w:val="20"/>
+          <w:ins w:id="141" w:author="Winston, Richard B" w:date="2025-06-01T10:17:00Z"/>
+        </w:trPr>
+        <w:tc>
+          <w:tcPr>
+            <w:tcW w:w="4050" w:type="dxa"/>
+          </w:tcPr>
+          <w:p>
+            <w:pPr>
+              <w:pStyle w:val="TableCellBody"/>
+              <w:rPr>
+                <w:ins w:id="142" w:author="Winston, Richard B" w:date="2025-06-01T10:17:00Z"/>
+              </w:rPr>
+            </w:pPr>
+            <w:ins w:id="143" w:author="Winston, Richard B" w:date="2025-06-01T10:20:00Z">
+              <w:r>
+                <w:t>Observation (OBS) Utility for GW</w:t>
+              </w:r>
+              <w:r>
+                <w:t>E</w:t>
+              </w:r>
+            </w:ins>
+          </w:p>
+        </w:tc>
+        <w:tc>
+          <w:tcPr>
+            <w:tcW w:w="1440" w:type="dxa"/>
+          </w:tcPr>
+          <w:p>
+            <w:pPr>
+              <w:pStyle w:val="TableCellBody"/>
+              <w:rPr>
+                <w:ins w:id="144" w:author="Winston, Richard B" w:date="2025-06-01T10:17:00Z"/>
+              </w:rPr>
+            </w:pPr>
+            <w:ins w:id="145" w:author="Winston, Richard B" w:date="2025-06-01T10:20:00Z">
+              <w:r>
+                <w:t>s</w:t>
+              </w:r>
+              <w:r>
+                <w:t>upported</w:t>
+              </w:r>
+            </w:ins>
+          </w:p>
+        </w:tc>
+        <w:tc>
+          <w:tcPr>
+            <w:tcW w:w="3870" w:type="dxa"/>
+            <w:vAlign w:val="center"/>
+          </w:tcPr>
+          <w:p>
+            <w:pPr>
+              <w:pStyle w:val="TableCellBody"/>
+              <w:rPr>
+                <w:ins w:id="146" w:author="Winston, Richard B" w:date="2025-06-01T10:17:00Z"/>
+              </w:rPr>
+            </w:pPr>
+          </w:p>
+        </w:tc>
+      </w:tr>
+      <w:tr>
+        <w:trPr>
+          <w:trHeight w:val="20"/>
+          <w:ins w:id="147" w:author="Winston, Richard B" w:date="2025-06-01T10:17:00Z"/>
+        </w:trPr>
+        <w:tc>
+          <w:tcPr>
+            <w:tcW w:w="4050" w:type="dxa"/>
+          </w:tcPr>
+          <w:p>
+            <w:pPr>
+              <w:pStyle w:val="TableCellBody"/>
+              <w:rPr>
+                <w:ins w:id="148" w:author="Winston, Richard B" w:date="2025-06-01T10:17:00Z"/>
+              </w:rPr>
+            </w:pPr>
+            <w:ins w:id="149" w:author="Winston, Richard B" w:date="2025-06-01T10:21:00Z">
+              <w:r>
+                <w:t>Advection (ADV) Package for GW</w:t>
+              </w:r>
+              <w:r>
+                <w:t>E</w:t>
+              </w:r>
+            </w:ins>
+          </w:p>
+        </w:tc>
+        <w:tc>
+          <w:tcPr>
+            <w:tcW w:w="1440" w:type="dxa"/>
+          </w:tcPr>
+          <w:p>
+            <w:pPr>
+              <w:pStyle w:val="TableCellBody"/>
+              <w:rPr>
+                <w:ins w:id="150" w:author="Winston, Richard B" w:date="2025-06-01T10:17:00Z"/>
+              </w:rPr>
+            </w:pPr>
+            <w:ins w:id="151" w:author="Winston, Richard B" w:date="2025-06-01T10:21:00Z">
+              <w:r>
+                <w:t>s</w:t>
+              </w:r>
+              <w:r>
+                <w:t>upported</w:t>
+              </w:r>
+            </w:ins>
+          </w:p>
+        </w:tc>
+        <w:tc>
+          <w:tcPr>
+            <w:tcW w:w="3870" w:type="dxa"/>
+            <w:vAlign w:val="center"/>
+          </w:tcPr>
+          <w:p>
+            <w:pPr>
+              <w:pStyle w:val="TableCellBody"/>
+              <w:rPr>
+                <w:ins w:id="152" w:author="Winston, Richard B" w:date="2025-06-01T10:17:00Z"/>
+              </w:rPr>
+            </w:pPr>
+          </w:p>
+        </w:tc>
+      </w:tr>
+      <w:tr>
+        <w:trPr>
+          <w:trHeight w:val="20"/>
+          <w:ins w:id="153" w:author="Winston, Richard B" w:date="2025-06-01T10:21:00Z"/>
+        </w:trPr>
+        <w:tc>
+          <w:tcPr>
+            <w:tcW w:w="4050" w:type="dxa"/>
+          </w:tcPr>
+          <w:p>
+            <w:pPr>
+              <w:pStyle w:val="TableCellBody"/>
+              <w:rPr>
+                <w:ins w:id="154" w:author="Winston, Richard B" w:date="2025-06-01T10:21:00Z"/>
+              </w:rPr>
+            </w:pPr>
+            <w:ins w:id="155" w:author="Winston, Richard B" w:date="2025-06-01T10:21:00Z">
+              <w:r>
+                <w:t>Conduction and Dispersion</w:t>
+              </w:r>
+              <w:r>
+                <w:t xml:space="preserve"> (</w:t>
+              </w:r>
+              <w:r>
+                <w:t>CND</w:t>
+              </w:r>
+              <w:r>
+                <w:t>) Package for GWE</w:t>
+              </w:r>
+            </w:ins>
+          </w:p>
+        </w:tc>
+        <w:tc>
+          <w:tcPr>
+            <w:tcW w:w="1440" w:type="dxa"/>
+          </w:tcPr>
+          <w:p>
+            <w:pPr>
+              <w:pStyle w:val="TableCellBody"/>
+              <w:rPr>
+                <w:ins w:id="156" w:author="Winston, Richard B" w:date="2025-06-01T10:21:00Z"/>
+              </w:rPr>
+            </w:pPr>
+            <w:ins w:id="157" w:author="Winston, Richard B" w:date="2025-06-01T10:21:00Z">
+              <w:r>
+                <w:t>s</w:t>
+              </w:r>
+              <w:r>
+                <w:t>upported</w:t>
+              </w:r>
+            </w:ins>
+          </w:p>
+        </w:tc>
+        <w:tc>
+          <w:tcPr>
+            <w:tcW w:w="3870" w:type="dxa"/>
+            <w:vAlign w:val="center"/>
+          </w:tcPr>
+          <w:p>
+            <w:pPr>
+              <w:pStyle w:val="TableCellBody"/>
+              <w:rPr>
+                <w:ins w:id="158" w:author="Winston, Richard B" w:date="2025-06-01T10:21:00Z"/>
+              </w:rPr>
+            </w:pPr>
+          </w:p>
+        </w:tc>
+      </w:tr>
+      <w:tr>
+        <w:trPr>
+          <w:trHeight w:val="20"/>
+          <w:ins w:id="159" w:author="Winston, Richard B" w:date="2025-06-01T10:21:00Z"/>
+        </w:trPr>
+        <w:tc>
+          <w:tcPr>
+            <w:tcW w:w="4050" w:type="dxa"/>
+          </w:tcPr>
+          <w:p>
+            <w:pPr>
+              <w:pStyle w:val="TableCellBody"/>
+              <w:rPr>
+                <w:ins w:id="160" w:author="Winston, Richard B" w:date="2025-06-01T10:21:00Z"/>
+              </w:rPr>
+            </w:pPr>
+            <w:ins w:id="161" w:author="Winston, Richard B" w:date="2025-06-01T10:22:00Z">
+              <w:r>
+                <w:t>Energy Storage and Transfer (EST</w:t>
+              </w:r>
+              <w:r>
+                <w:t>) Package for GWE</w:t>
+              </w:r>
+            </w:ins>
+          </w:p>
+        </w:tc>
+        <w:tc>
+          <w:tcPr>
+            <w:tcW w:w="1440" w:type="dxa"/>
+          </w:tcPr>
+          <w:p>
+            <w:pPr>
+              <w:pStyle w:val="TableCellBody"/>
+              <w:rPr>
+                <w:ins w:id="162" w:author="Winston, Richard B" w:date="2025-06-01T10:21:00Z"/>
+              </w:rPr>
+            </w:pPr>
+            <w:ins w:id="163" w:author="Winston, Richard B" w:date="2025-06-01T10:22:00Z">
+              <w:r>
+                <w:t>s</w:t>
+              </w:r>
+              <w:r>
+                <w:t>upported</w:t>
+              </w:r>
+            </w:ins>
+          </w:p>
+        </w:tc>
+        <w:tc>
+          <w:tcPr>
+            <w:tcW w:w="3870" w:type="dxa"/>
+            <w:vAlign w:val="center"/>
+          </w:tcPr>
+          <w:p>
+            <w:pPr>
+              <w:pStyle w:val="TableCellBody"/>
+              <w:rPr>
+                <w:ins w:id="164" w:author="Winston, Richard B" w:date="2025-06-01T10:21:00Z"/>
+              </w:rPr>
+            </w:pPr>
+          </w:p>
+        </w:tc>
+      </w:tr>
+      <w:tr>
+        <w:trPr>
+          <w:trHeight w:val="20"/>
+          <w:ins w:id="165" w:author="Winston, Richard B" w:date="2025-06-01T10:21:00Z"/>
+        </w:trPr>
+        <w:tc>
+          <w:tcPr>
+            <w:tcW w:w="4050" w:type="dxa"/>
+          </w:tcPr>
+          <w:p>
+            <w:pPr>
+              <w:pStyle w:val="TableCellBody"/>
+              <w:rPr>
+                <w:ins w:id="166" w:author="Winston, Richard B" w:date="2025-06-01T10:21:00Z"/>
+              </w:rPr>
+            </w:pPr>
+            <w:ins w:id="167" w:author="Winston, Richard B" w:date="2025-06-01T10:22:00Z">
+              <w:r>
+                <w:t>Source and Sink Mixing (SSM) Package for GWE</w:t>
+              </w:r>
+            </w:ins>
+          </w:p>
+        </w:tc>
+        <w:tc>
+          <w:tcPr>
+            <w:tcW w:w="1440" w:type="dxa"/>
+          </w:tcPr>
+          <w:p>
+            <w:pPr>
+              <w:pStyle w:val="TableCellBody"/>
+              <w:rPr>
+                <w:ins w:id="168" w:author="Winston, Richard B" w:date="2025-06-01T10:21:00Z"/>
+              </w:rPr>
+            </w:pPr>
+            <w:ins w:id="169" w:author="Winston, Richard B" w:date="2025-06-01T10:22:00Z">
+              <w:r>
+                <w:t>s</w:t>
+              </w:r>
+              <w:r>
+                <w:t>upported</w:t>
+              </w:r>
+            </w:ins>
+          </w:p>
+        </w:tc>
+        <w:tc>
+          <w:tcPr>
+            <w:tcW w:w="3870" w:type="dxa"/>
+            <w:vAlign w:val="center"/>
+          </w:tcPr>
+          <w:p>
+            <w:pPr>
+              <w:pStyle w:val="TableCellBody"/>
+              <w:rPr>
+                <w:ins w:id="170" w:author="Winston, Richard B" w:date="2025-06-01T10:21:00Z"/>
+              </w:rPr>
+            </w:pPr>
+          </w:p>
+        </w:tc>
+      </w:tr>
+      <w:tr>
+        <w:trPr>
+          <w:trHeight w:val="20"/>
+          <w:ins w:id="171" w:author="Winston, Richard B" w:date="2025-06-01T10:21:00Z"/>
+        </w:trPr>
+        <w:tc>
+          <w:tcPr>
+            <w:tcW w:w="4050" w:type="dxa"/>
+          </w:tcPr>
+          <w:p>
+            <w:pPr>
+              <w:pStyle w:val="TableCellBody"/>
+              <w:rPr>
+                <w:ins w:id="172" w:author="Winston, Richard B" w:date="2025-06-01T10:21:00Z"/>
+              </w:rPr>
+            </w:pPr>
+            <w:ins w:id="173" w:author="Winston, Richard B" w:date="2025-06-01T10:23:00Z">
+              <w:r>
+                <w:t xml:space="preserve">Constant </w:t>
+              </w:r>
+              <w:r>
+                <w:t>Temperature</w:t>
+              </w:r>
+              <w:r>
+                <w:t xml:space="preserve"> (</w:t>
+              </w:r>
+              <w:r>
+                <w:t>CTP</w:t>
+              </w:r>
+              <w:r>
+                <w:t>) Package for GWE</w:t>
+              </w:r>
+            </w:ins>
+          </w:p>
+        </w:tc>
+        <w:tc>
+          <w:tcPr>
+            <w:tcW w:w="1440" w:type="dxa"/>
+          </w:tcPr>
+          <w:p>
+            <w:pPr>
+              <w:pStyle w:val="TableCellBody"/>
+              <w:rPr>
+                <w:ins w:id="174" w:author="Winston, Richard B" w:date="2025-06-01T10:21:00Z"/>
+              </w:rPr>
+            </w:pPr>
+            <w:ins w:id="175" w:author="Winston, Richard B" w:date="2025-06-01T10:23:00Z">
+              <w:r>
+                <w:t>s</w:t>
+              </w:r>
+              <w:r>
+                <w:t>upported</w:t>
+              </w:r>
+            </w:ins>
+          </w:p>
+        </w:tc>
+        <w:tc>
+          <w:tcPr>
+            <w:tcW w:w="3870" w:type="dxa"/>
+            <w:vAlign w:val="center"/>
+          </w:tcPr>
+          <w:p>
+            <w:pPr>
+              <w:pStyle w:val="TableCellBody"/>
+              <w:rPr>
+                <w:ins w:id="176" w:author="Winston, Richard B" w:date="2025-06-01T10:21:00Z"/>
+              </w:rPr>
+            </w:pPr>
+          </w:p>
+        </w:tc>
+      </w:tr>
+      <w:tr>
+        <w:trPr>
+          <w:trHeight w:val="20"/>
+          <w:ins w:id="177" w:author="Winston, Richard B" w:date="2025-06-01T10:21:00Z"/>
+        </w:trPr>
+        <w:tc>
+          <w:tcPr>
+            <w:tcW w:w="4050" w:type="dxa"/>
+          </w:tcPr>
+          <w:p>
+            <w:pPr>
+              <w:pStyle w:val="TableCellBody"/>
+              <w:rPr>
+                <w:ins w:id="178" w:author="Winston, Richard B" w:date="2025-06-01T10:21:00Z"/>
+              </w:rPr>
+            </w:pPr>
+            <w:ins w:id="179" w:author="Winston, Richard B" w:date="2025-06-01T10:23:00Z">
+              <w:r>
+                <w:t>Energy Source Load</w:t>
+              </w:r>
+            </w:ins>
+            <w:ins w:id="180" w:author="Winston, Richard B" w:date="2025-06-01T10:24:00Z">
+              <w:r>
+                <w:t>ing</w:t>
+              </w:r>
+            </w:ins>
+            <w:ins w:id="181" w:author="Winston, Richard B" w:date="2025-06-01T10:23:00Z">
+              <w:r>
+                <w:t xml:space="preserve"> (</w:t>
+              </w:r>
+            </w:ins>
+            <w:ins w:id="182" w:author="Winston, Richard B" w:date="2025-06-01T10:24:00Z">
+              <w:r>
+                <w:t>ESL</w:t>
+              </w:r>
+            </w:ins>
+            <w:ins w:id="183" w:author="Winston, Richard B" w:date="2025-06-01T10:23:00Z">
+              <w:r>
+                <w:t>) Package for GWE</w:t>
+              </w:r>
+            </w:ins>
+          </w:p>
+        </w:tc>
+        <w:tc>
+          <w:tcPr>
+            <w:tcW w:w="1440" w:type="dxa"/>
+          </w:tcPr>
+          <w:p>
+            <w:pPr>
+              <w:pStyle w:val="TableCellBody"/>
+              <w:rPr>
+                <w:ins w:id="184" w:author="Winston, Richard B" w:date="2025-06-01T10:21:00Z"/>
+              </w:rPr>
+            </w:pPr>
+            <w:ins w:id="185" w:author="Winston, Richard B" w:date="2025-06-01T10:23:00Z">
+              <w:r>
+                <w:t>s</w:t>
+              </w:r>
+              <w:r>
+                <w:t>upported</w:t>
+              </w:r>
+            </w:ins>
+          </w:p>
+        </w:tc>
+        <w:tc>
+          <w:tcPr>
+            <w:tcW w:w="3870" w:type="dxa"/>
+            <w:vAlign w:val="center"/>
+          </w:tcPr>
+          <w:p>
+            <w:pPr>
+              <w:pStyle w:val="TableCellBody"/>
+              <w:rPr>
+                <w:ins w:id="186" w:author="Winston, Richard B" w:date="2025-06-01T10:21:00Z"/>
+              </w:rPr>
+            </w:pPr>
+          </w:p>
+        </w:tc>
+      </w:tr>
+      <w:tr>
+        <w:trPr>
+          <w:trHeight w:val="20"/>
+          <w:ins w:id="187" w:author="Winston, Richard B" w:date="2025-06-01T10:23:00Z"/>
+        </w:trPr>
+        <w:tc>
+          <w:tcPr>
+            <w:tcW w:w="4050" w:type="dxa"/>
+          </w:tcPr>
+          <w:p>
+            <w:pPr>
+              <w:pStyle w:val="TableCellBody"/>
+              <w:rPr>
+                <w:ins w:id="188" w:author="Winston, Richard B" w:date="2025-06-01T10:23:00Z"/>
+              </w:rPr>
+            </w:pPr>
+            <w:ins w:id="189" w:author="Winston, Richard B" w:date="2025-06-01T10:24:00Z">
+              <w:r>
+                <w:t xml:space="preserve">Streamflow </w:t>
+              </w:r>
+              <w:r>
+                <w:t xml:space="preserve">Energy </w:t>
+              </w:r>
+              <w:r>
+                <w:t>Transport (SF</w:t>
+              </w:r>
+              <w:r>
+                <w:t>E</w:t>
+              </w:r>
+              <w:r>
+                <w:t>) Package for GWE</w:t>
+              </w:r>
+            </w:ins>
+          </w:p>
+        </w:tc>
+        <w:tc>
+          <w:tcPr>
+            <w:tcW w:w="1440" w:type="dxa"/>
+          </w:tcPr>
+          <w:p>
+            <w:pPr>
+              <w:pStyle w:val="TableCellBody"/>
+              <w:rPr>
+                <w:ins w:id="190" w:author="Winston, Richard B" w:date="2025-06-01T10:23:00Z"/>
+              </w:rPr>
+            </w:pPr>
+            <w:ins w:id="191" w:author="Winston, Richard B" w:date="2025-06-01T10:24:00Z">
+              <w:r>
+                <w:t>s</w:t>
+              </w:r>
+              <w:r>
+                <w:t>upported</w:t>
+              </w:r>
+            </w:ins>
+          </w:p>
+        </w:tc>
+        <w:tc>
+          <w:tcPr>
+            <w:tcW w:w="3870" w:type="dxa"/>
+            <w:vAlign w:val="center"/>
+          </w:tcPr>
+          <w:p>
+            <w:pPr>
+              <w:pStyle w:val="TableCellBody"/>
+              <w:rPr>
+                <w:ins w:id="192" w:author="Winston, Richard B" w:date="2025-06-01T10:23:00Z"/>
+              </w:rPr>
+            </w:pPr>
+          </w:p>
+        </w:tc>
+      </w:tr>
+      <w:tr>
+        <w:trPr>
+          <w:trHeight w:val="20"/>
+          <w:ins w:id="193" w:author="Winston, Richard B" w:date="2025-06-01T10:23:00Z"/>
+        </w:trPr>
+        <w:tc>
+          <w:tcPr>
+            <w:tcW w:w="4050" w:type="dxa"/>
+          </w:tcPr>
+          <w:p>
+            <w:pPr>
+              <w:pStyle w:val="TableCellBody"/>
+              <w:rPr>
+                <w:ins w:id="194" w:author="Winston, Richard B" w:date="2025-06-01T10:23:00Z"/>
+              </w:rPr>
+            </w:pPr>
+            <w:ins w:id="195" w:author="Winston, Richard B" w:date="2025-06-01T10:24:00Z">
+              <w:r>
+                <w:t xml:space="preserve">Lake </w:t>
+              </w:r>
+              <w:r>
+                <w:t xml:space="preserve">Energy </w:t>
+              </w:r>
+              <w:r>
+                <w:t>Transport (LK</w:t>
+              </w:r>
+              <w:r>
+                <w:t>E</w:t>
+              </w:r>
+              <w:r>
+                <w:t xml:space="preserve">) Package for </w:t>
+              </w:r>
+            </w:ins>
+            <w:ins w:id="196" w:author="Winston, Richard B" w:date="2025-06-01T10:25:00Z">
+              <w:r>
+                <w:t>GWE</w:t>
+              </w:r>
+            </w:ins>
+          </w:p>
+        </w:tc>
+        <w:tc>
+          <w:tcPr>
+            <w:tcW w:w="1440" w:type="dxa"/>
+          </w:tcPr>
+          <w:p>
+            <w:pPr>
+              <w:pStyle w:val="TableCellBody"/>
+              <w:rPr>
+                <w:ins w:id="197" w:author="Winston, Richard B" w:date="2025-06-01T10:23:00Z"/>
+              </w:rPr>
+            </w:pPr>
+            <w:ins w:id="198" w:author="Winston, Richard B" w:date="2025-06-01T10:24:00Z">
+              <w:r>
+                <w:t>s</w:t>
+              </w:r>
+              <w:r>
+                <w:t>upported</w:t>
+              </w:r>
+            </w:ins>
+          </w:p>
+        </w:tc>
+        <w:tc>
+          <w:tcPr>
+            <w:tcW w:w="3870" w:type="dxa"/>
+            <w:vAlign w:val="center"/>
+          </w:tcPr>
+          <w:p>
+            <w:pPr>
+              <w:pStyle w:val="TableCellBody"/>
+              <w:rPr>
+                <w:ins w:id="199" w:author="Winston, Richard B" w:date="2025-06-01T10:23:00Z"/>
+              </w:rPr>
+            </w:pPr>
+          </w:p>
+        </w:tc>
+      </w:tr>
+      <w:tr>
+        <w:trPr>
+          <w:trHeight w:val="20"/>
+          <w:ins w:id="200" w:author="Winston, Richard B" w:date="2025-06-01T10:23:00Z"/>
+        </w:trPr>
+        <w:tc>
+          <w:tcPr>
+            <w:tcW w:w="4050" w:type="dxa"/>
+          </w:tcPr>
+          <w:p>
+            <w:pPr>
+              <w:pStyle w:val="TableCellBody"/>
+              <w:rPr>
+                <w:ins w:id="201" w:author="Winston, Richard B" w:date="2025-06-01T10:23:00Z"/>
+              </w:rPr>
+            </w:pPr>
+            <w:ins w:id="202" w:author="Winston, Richard B" w:date="2025-06-01T10:25:00Z">
+              <w:r>
+                <w:t xml:space="preserve">Multi-Aquifer Well </w:t>
+              </w:r>
+              <w:r>
+                <w:t xml:space="preserve">Energy </w:t>
+              </w:r>
+              <w:r>
+                <w:t>Transport (MW</w:t>
+              </w:r>
+              <w:r>
+                <w:t>E</w:t>
+              </w:r>
+              <w:r>
+                <w:t>) Package for GWE</w:t>
+              </w:r>
+            </w:ins>
+          </w:p>
+        </w:tc>
+        <w:tc>
+          <w:tcPr>
+            <w:tcW w:w="1440" w:type="dxa"/>
+          </w:tcPr>
+          <w:p>
+            <w:pPr>
+              <w:pStyle w:val="TableCellBody"/>
+              <w:rPr>
+                <w:ins w:id="203" w:author="Winston, Richard B" w:date="2025-06-01T10:23:00Z"/>
+              </w:rPr>
+            </w:pPr>
+            <w:ins w:id="204" w:author="Winston, Richard B" w:date="2025-06-01T10:25:00Z">
+              <w:r>
+                <w:t>s</w:t>
+              </w:r>
+              <w:r>
+                <w:t>upported</w:t>
+              </w:r>
+            </w:ins>
+          </w:p>
+        </w:tc>
+        <w:tc>
+          <w:tcPr>
+            <w:tcW w:w="3870" w:type="dxa"/>
+            <w:vAlign w:val="center"/>
+          </w:tcPr>
+          <w:p>
+            <w:pPr>
+              <w:pStyle w:val="TableCellBody"/>
+              <w:rPr>
+                <w:ins w:id="205" w:author="Winston, Richard B" w:date="2025-06-01T10:23:00Z"/>
+              </w:rPr>
+            </w:pPr>
+          </w:p>
+        </w:tc>
+      </w:tr>
+      <w:tr>
+        <w:trPr>
+          <w:trHeight w:val="20"/>
+          <w:ins w:id="206" w:author="Winston, Richard B" w:date="2025-06-01T10:23:00Z"/>
+        </w:trPr>
+        <w:tc>
+          <w:tcPr>
+            <w:tcW w:w="4050" w:type="dxa"/>
+          </w:tcPr>
+          <w:p>
+            <w:pPr>
+              <w:pStyle w:val="TableCellBody"/>
+              <w:rPr>
+                <w:ins w:id="207" w:author="Winston, Richard B" w:date="2025-06-01T10:23:00Z"/>
+              </w:rPr>
+            </w:pPr>
+            <w:ins w:id="208" w:author="Winston, Richard B" w:date="2025-06-01T10:25:00Z">
+              <w:r>
+                <w:t xml:space="preserve">Unsaturated Zone </w:t>
+              </w:r>
+              <w:r>
+                <w:t xml:space="preserve">Energy </w:t>
+              </w:r>
+              <w:r>
+                <w:t>Transport (UZ</w:t>
+              </w:r>
+              <w:r>
+                <w:t>E</w:t>
+              </w:r>
+              <w:r>
+                <w:t>) Package for GWE</w:t>
+              </w:r>
+            </w:ins>
+          </w:p>
+        </w:tc>
+        <w:tc>
+          <w:tcPr>
+            <w:tcW w:w="1440" w:type="dxa"/>
+          </w:tcPr>
+          <w:p>
+            <w:pPr>
+              <w:pStyle w:val="TableCellBody"/>
+              <w:rPr>
+                <w:ins w:id="209" w:author="Winston, Richard B" w:date="2025-06-01T10:23:00Z"/>
+              </w:rPr>
+            </w:pPr>
+            <w:ins w:id="210" w:author="Winston, Richard B" w:date="2025-06-01T10:25:00Z">
+              <w:r>
+                <w:t>s</w:t>
+              </w:r>
+              <w:r>
+                <w:t>upported</w:t>
+              </w:r>
+            </w:ins>
+          </w:p>
+        </w:tc>
+        <w:tc>
+          <w:tcPr>
+            <w:tcW w:w="3870" w:type="dxa"/>
+            <w:vAlign w:val="center"/>
+          </w:tcPr>
+          <w:p>
+            <w:pPr>
+              <w:pStyle w:val="TableCellBody"/>
+              <w:rPr>
+                <w:ins w:id="211" w:author="Winston, Richard B" w:date="2025-06-01T10:23:00Z"/>
+              </w:rPr>
+            </w:pPr>
+          </w:p>
+        </w:tc>
+      </w:tr>
+      <w:tr>
+        <w:trPr>
+          <w:trHeight w:val="20"/>
+          <w:ins w:id="212" w:author="Winston, Richard B" w:date="2025-06-01T10:23:00Z"/>
+        </w:trPr>
+        <w:tc>
+          <w:tcPr>
+            <w:tcW w:w="4050" w:type="dxa"/>
+          </w:tcPr>
+          <w:p>
+            <w:pPr>
+              <w:pStyle w:val="TableCellBody"/>
+              <w:rPr>
+                <w:ins w:id="213" w:author="Winston, Richard B" w:date="2025-06-01T10:23:00Z"/>
+              </w:rPr>
+            </w:pPr>
+            <w:ins w:id="214" w:author="Winston, Richard B" w:date="2025-06-01T10:25:00Z">
+              <w:r>
+                <w:t xml:space="preserve">Flow Model Interface (FMI) Package for </w:t>
+              </w:r>
+            </w:ins>
+            <w:ins w:id="215" w:author="Winston, Richard B" w:date="2025-06-01T10:26:00Z">
+              <w:r>
+                <w:t>GWE</w:t>
+              </w:r>
+            </w:ins>
+          </w:p>
+        </w:tc>
+        <w:tc>
+          <w:tcPr>
+            <w:tcW w:w="1440" w:type="dxa"/>
+          </w:tcPr>
+          <w:p>
+            <w:pPr>
+              <w:pStyle w:val="TableCellBody"/>
+              <w:rPr>
+                <w:ins w:id="216" w:author="Winston, Richard B" w:date="2025-06-01T10:23:00Z"/>
+              </w:rPr>
+            </w:pPr>
+            <w:ins w:id="217" w:author="Winston, Richard B" w:date="2025-06-01T10:25:00Z">
+              <w:r>
+                <w:t>s</w:t>
+              </w:r>
+              <w:r>
+                <w:t>upported</w:t>
+              </w:r>
+            </w:ins>
+          </w:p>
+        </w:tc>
+        <w:tc>
+          <w:tcPr>
+            <w:tcW w:w="3870" w:type="dxa"/>
+            <w:vAlign w:val="center"/>
+          </w:tcPr>
+          <w:p>
+            <w:pPr>
+              <w:pStyle w:val="TableCellBody"/>
+              <w:rPr>
+                <w:ins w:id="218" w:author="Winston, Richard B" w:date="2025-06-01T10:23:00Z"/>
+              </w:rPr>
+            </w:pPr>
+          </w:p>
+        </w:tc>
+      </w:tr>
+      <w:tr>
+        <w:trPr>
+          <w:trHeight w:val="20"/>
+          <w:ins w:id="219" w:author="Winston, Richard B" w:date="2025-06-01T10:17:00Z"/>
+        </w:trPr>
+        <w:tc>
+          <w:tcPr>
+            <w:tcW w:w="4050" w:type="dxa"/>
+          </w:tcPr>
+          <w:p>
+            <w:pPr>
+              <w:pStyle w:val="TableCellBody"/>
+              <w:rPr>
+                <w:ins w:id="220" w:author="Winston, Richard B" w:date="2025-06-01T10:17:00Z"/>
+              </w:rPr>
+            </w:pPr>
+            <w:ins w:id="221" w:author="Winston, Richard B" w:date="2025-06-01T10:26:00Z">
+              <w:r>
+                <w:t xml:space="preserve">Mover </w:t>
+              </w:r>
+              <w:r>
+                <w:t xml:space="preserve">Energy </w:t>
+              </w:r>
+              <w:r>
+                <w:t>Transport (MV</w:t>
+              </w:r>
+              <w:r>
+                <w:t>E</w:t>
+              </w:r>
+              <w:r>
+                <w:t>) Package for GWE</w:t>
+              </w:r>
+            </w:ins>
+          </w:p>
+        </w:tc>
+        <w:tc>
+          <w:tcPr>
+            <w:tcW w:w="1440" w:type="dxa"/>
+          </w:tcPr>
+          <w:p>
+            <w:pPr>
+              <w:pStyle w:val="TableCellBody"/>
+              <w:rPr>
+                <w:ins w:id="222" w:author="Winston, Richard B" w:date="2025-06-01T10:17:00Z"/>
+              </w:rPr>
+            </w:pPr>
+            <w:ins w:id="223" w:author="Winston, Richard B" w:date="2025-06-01T10:26:00Z">
+              <w:r>
+                <w:t>s</w:t>
+              </w:r>
+              <w:r>
+                <w:t>upported</w:t>
+              </w:r>
+            </w:ins>
+          </w:p>
+        </w:tc>
+        <w:tc>
+          <w:tcPr>
+            <w:tcW w:w="3870" w:type="dxa"/>
+            <w:vAlign w:val="center"/>
+          </w:tcPr>
+          <w:p>
+            <w:pPr>
+              <w:pStyle w:val="TableCellBody"/>
+              <w:rPr>
+                <w:ins w:id="224" w:author="Winston, Richard B" w:date="2025-06-01T10:17:00Z"/>
+              </w:rPr>
+            </w:pPr>
+          </w:p>
+        </w:tc>
+      </w:tr>
+      <w:tr>
+        <w:trPr>
+          <w:trHeight w:val="20"/>
+          <w:ins w:id="225" w:author="Winston, Richard B" w:date="2025-06-01T10:06:00Z"/>
+        </w:trPr>
+        <w:tc>
+          <w:tcPr>
+            <w:tcW w:w="4050" w:type="dxa"/>
+          </w:tcPr>
+          <w:p>
+            <w:pPr>
+              <w:pStyle w:val="TableCellBody"/>
+              <w:rPr>
+                <w:ins w:id="226" w:author="Winston, Richard B" w:date="2025-06-01T10:06:00Z"/>
+              </w:rPr>
+            </w:pPr>
+            <w:ins w:id="227" w:author="Winston, Richard B" w:date="2025-06-01T10:06:00Z">
+              <w:r>
+                <w:t>Groundwater Energy Transport (GWE) Exchange</w:t>
+              </w:r>
+            </w:ins>
+          </w:p>
+        </w:tc>
+        <w:tc>
+          <w:tcPr>
+            <w:tcW w:w="1440" w:type="dxa"/>
+          </w:tcPr>
+          <w:p>
+            <w:pPr>
+              <w:pStyle w:val="TableCellBody"/>
+              <w:rPr>
+                <w:ins w:id="228" w:author="Winston, Richard B" w:date="2025-06-01T10:06:00Z"/>
+              </w:rPr>
+            </w:pPr>
+            <w:ins w:id="229" w:author="Winston, Richard B" w:date="2025-06-01T10:06:00Z">
+              <w:r>
+                <w:t xml:space="preserve">not </w:t>
+              </w:r>
+              <w:r>
+                <w:t>supported</w:t>
+              </w:r>
+            </w:ins>
+          </w:p>
+        </w:tc>
+        <w:tc>
+          <w:tcPr>
+            <w:tcW w:w="3870" w:type="dxa"/>
+            <w:vAlign w:val="center"/>
+          </w:tcPr>
+          <w:p>
+            <w:pPr>
+              <w:pStyle w:val="TableCellBody"/>
+              <w:rPr>
+                <w:ins w:id="230" w:author="Winston, Richard B" w:date="2025-06-01T10:06:00Z"/>
+              </w:rPr>
             </w:pPr>
           </w:p>
         </w:tc>
@@ -3499,6 +5737,14 @@
   </w:num>
   <w:numIdMacAtCleanup w:val="8"/>
 </w:numbering>
+</file>
+
+<file path=word/people.xml><?xml version="1.0" encoding="utf-8"?>
+<w15:people xmlns:wpc="http://schemas.microsoft.com/office/word/2010/wordprocessingCanvas" xmlns:cx="http://schemas.microsoft.com/office/drawing/2014/chartex" xmlns:cx1="http://schemas.microsoft.com/office/drawing/2015/9/8/chartex" xmlns:cx2="http://schemas.microsoft.com/office/drawing/2015/10/21/chartex" xmlns:cx3="http://schemas.microsoft.com/office/drawing/2016/5/9/chartex" xmlns:cx4="http://schemas.microsoft.com/office/drawing/2016/5/10/chartex" xmlns:cx5="http://schemas.microsoft.com/office/drawing/2016/5/11/chartex" xmlns:cx6="http://schemas.microsoft.com/office/drawing/2016/5/12/chartex" xmlns:cx7="http://schemas.microsoft.com/office/drawing/2016/5/13/chartex" xmlns:cx8="http://schemas.microsoft.com/office/drawing/2016/5/14/chartex" xmlns:mc="http://schemas.openxmlformats.org/markup-compatibility/2006" xmlns:aink="http://schemas.microsoft.com/office/drawing/2016/ink" xmlns:am3d="http://schemas.microsoft.com/office/drawing/2017/model3d" xmlns:o="urn:schemas-microsoft-com:office:office" xmlns:oel="http://schemas.microsoft.com/office/2019/extlst" xmlns:r="http://schemas.openxmlformats.org/officeDocument/2006/relationships" xmlns:m="http://schemas.openxmlformats.org/officeDocument/2006/math" xmlns:v="urn:schemas-microsoft-com:vml" xmlns:wp14="http://schemas.microsoft.com/office/word/2010/wordprocessingDrawing" xmlns:wp="http://schemas.openxmlformats.org/drawingml/2006/wordprocessingDrawing" xmlns:w10="urn:schemas-microsoft-com:office:word" xmlns:w="http://schemas.openxmlformats.org/wordprocessingml/2006/main" xmlns:w14="http://schemas.microsoft.com/office/word/2010/wordml" xmlns:w15="http://schemas.microsoft.com/office/word/2012/wordml" xmlns:w16cex="http://schemas.microsoft.com/office/word/2018/wordml/cex" xmlns:w16cid="http://schemas.microsoft.com/office/word/2016/wordml/cid" xmlns:w16="http://schemas.microsoft.com/office/word/2018/wordml" xmlns:w16sdtdh="http://schemas.microsoft.com/office/word/2020/wordml/sdtdatahash" xmlns:w16se="http://schemas.microsoft.com/office/word/2015/wordml/symex" xmlns:wpg="http://schemas.microsoft.com/office/word/2010/wordprocessingGroup" xmlns:wpi="http://schemas.microsoft.com/office/word/2010/wordprocessingInk" xmlns:wne="http://schemas.microsoft.com/office/word/2006/wordml" xmlns:wps="http://schemas.microsoft.com/office/word/2010/wordprocessingShape" mc:Ignorable="w14 w15 w16se w16cid w16 w16cex w16sdtdh wp14">
+  <w15:person w15:author="Winston, Richard B">
+    <w15:presenceInfo w15:providerId="AD" w15:userId="S::rbwinst@usgs.gov::841d45e3-7354-486f-bbba-6b475fc0b338"/>
+  </w15:person>
+</w15:people>
 </file>
 
 <file path=word/styles.xml><?xml version="1.0" encoding="utf-8"?>

</xml_diff>